<commit_message>
Update Popol Wuj to current illustrated v0.2 edition
Correct the front-matter page flow so the editorial note and contents share page 3. PDF and DOCX now have 19 pages. Preserve prose, sources, typography, background, and illustrations. Keep PR #44 open as draft; do not merge.
</commit_message>
<xml_diff>
--- a/book-collections/harvyrd-popol-wuj-v0.1/Popol-Vuh-RU.docx
+++ b/book-collections/harvyrd-popol-wuj-v0.1/Popol-Vuh-RU.docx
@@ -1,36 +1,70 @@
 
 <file path=word/document.xml><?xml version="1.0" encoding="utf-8"?>
 <w:document xmlns:wpc="http://schemas.microsoft.com/office/word/2010/wordprocessingCanvas" xmlns:mo="http://schemas.microsoft.com/office/mac/office/2008/main" xmlns:mc="http://schemas.openxmlformats.org/markup-compatibility/2006" xmlns:mv="urn:schemas-microsoft-com:mac:vml" xmlns:o="urn:schemas-microsoft-com:office:office" xmlns:r="http://schemas.openxmlformats.org/officeDocument/2006/relationships" xmlns:m="http://schemas.openxmlformats.org/officeDocument/2006/math" xmlns:v="urn:schemas-microsoft-com:vml" xmlns:wp14="http://schemas.microsoft.com/office/word/2010/wordprocessingDrawing" xmlns:wp="http://schemas.openxmlformats.org/drawingml/2006/wordprocessingDrawing" xmlns:w10="urn:schemas-microsoft-com:office:word" xmlns:w="http://schemas.openxmlformats.org/wordprocessingml/2006/main" xmlns:w14="http://schemas.microsoft.com/office/word/2010/wordml" xmlns:wpg="http://schemas.microsoft.com/office/word/2010/wordprocessingGroup" xmlns:wpi="http://schemas.microsoft.com/office/word/2010/wordprocessingInk" xmlns:wne="http://schemas.microsoft.com/office/word/2006/wordml" xmlns:wps="http://schemas.microsoft.com/office/word/2010/wordprocessingShape" mc:Ignorable="w14 wp14">
-  <w:background w:color="FBF8F0"/>
+  <w:background w:color="FAF6EC"/>
   <w:body>
     <w:p>
       <w:pPr>
-        <w:pStyle w:val="Title"/>
-        <w:spacing w:after="200"/>
+        <w:spacing w:after="40"/>
         <w:jc w:val="center"/>
       </w:pPr>
       <w:r>
+        <w:rPr>
+          <w:rFonts w:ascii="Noto Sans" w:hAnsi="Noto Sans" w:eastAsia="Noto Sans"/>
+          <w:b/>
+          <w:color w:val="B28B45"/>
+          <w:sz w:val="18"/>
+        </w:rPr>
+        <w:t>HARVYRÐ</w:t>
+      </w:r>
+    </w:p>
+    <w:p>
+      <w:pPr>
+        <w:pStyle w:val="Title"/>
+        <w:spacing w:after="80"/>
+        <w:jc w:val="center"/>
+      </w:pPr>
+      <w:r>
+        <w:rPr>
+          <w:rFonts w:ascii="Noto Serif" w:hAnsi="Noto Serif" w:eastAsia="Noto Serif"/>
+          <w:b/>
+          <w:color w:val="18264E"/>
+          <w:sz w:val="44"/>
+        </w:rPr>
         <w:t>POPOL VUH / POPOL WUJ</w:t>
       </w:r>
     </w:p>
     <w:p>
       <w:pPr>
-        <w:pStyle w:val="Heading2"/>
+        <w:spacing w:after="160"/>
+        <w:jc w:val="center"/>
       </w:pPr>
       <w:r>
+        <w:rPr>
+          <w:rFonts w:ascii="Noto Serif" w:hAnsi="Noto Serif" w:eastAsia="Noto Serif"/>
+          <w:color w:val="247F87"/>
+          <w:sz w:val="26"/>
+        </w:rPr>
         <w:t>Голоса, испытания и память К’иче’</w:t>
       </w:r>
     </w:p>
     <w:p>
       <w:pPr>
-        <w:spacing w:after="100"/>
+        <w:spacing w:before="80" w:after="60"/>
+        <w:ind w:firstLine="0"/>
         <w:jc w:val="center"/>
+        <w:pBdr>
+          <w:top w:val="single" w:sz="7" w:space="5" w:color="B28B45"/>
+          <w:left w:val="single" w:sz="7" w:space="5" w:color="B28B45"/>
+          <w:bottom w:val="single" w:sz="7" w:space="5" w:color="B28B45"/>
+          <w:right w:val="single" w:sz="7" w:space="5" w:color="B28B45"/>
+        </w:pBdr>
       </w:pPr>
       <w:r>
         <w:drawing>
           <wp:inline xmlns:a="http://schemas.openxmlformats.org/drawingml/2006/main" xmlns:pic="http://schemas.openxmlformats.org/drawingml/2006/picture">
-            <wp:extent cx="2423160" cy="3634740"/>
-            <wp:docPr id="1" name="Picture 1"/>
+            <wp:extent cx="2832000" cy="4248000"/>
+            <wp:docPr id="1" name="Picture 1" descr="Авторская обложечная иллюстрация: кукуруза, горы, вода и раскрытая книга; это не изображение исторического артефакта" title="cover"/>
             <wp:cNvGraphicFramePr>
               <a:graphicFrameLocks noChangeAspect="1"/>
             </wp:cNvGraphicFramePr>
@@ -38,7 +72,7 @@
               <a:graphicData uri="http://schemas.openxmlformats.org/drawingml/2006/picture">
                 <pic:pic>
                   <pic:nvPicPr>
-                    <pic:cNvPr id="0" name="image.jpg"/>
+                    <pic:cNvPr id="0" name="cover.jpg"/>
                     <pic:cNvPicPr/>
                   </pic:nvPicPr>
                   <pic:blipFill>
@@ -50,7 +84,7 @@
                   <pic:spPr>
                     <a:xfrm>
                       <a:off x="0" y="0"/>
-                      <a:ext cx="2423160" cy="3634740"/>
+                      <a:ext cx="2832000" cy="4248000"/>
                     </a:xfrm>
                     <a:prstGeom prst="rect"/>
                   </pic:spPr>
@@ -63,17 +97,34 @@
     </w:p>
     <w:p>
       <w:pPr>
+        <w:spacing w:after="80"/>
         <w:ind w:firstLine="0"/>
         <w:jc w:val="center"/>
       </w:pPr>
       <w:r>
         <w:rPr>
-          <w:rFonts w:ascii="Georgia" w:hAnsi="Georgia" w:eastAsia="Georgia"/>
+          <w:rFonts w:ascii="Noto Serif" w:hAnsi="Noto Serif" w:eastAsia="Noto Serif"/>
           <w:i/>
-          <w:color w:val="278F91"/>
+          <w:color w:val="18264E"/>
           <w:sz w:val="18"/>
         </w:rPr>
         <w:t>Иллюстрированный авторский русский пересказ повествования K’iche’ — с примечаниями о рукописи и переводе</w:t>
+      </w:r>
+    </w:p>
+    <w:p>
+      <w:pPr>
+        <w:spacing w:after="80"/>
+        <w:ind w:firstLine="0"/>
+        <w:jc w:val="center"/>
+      </w:pPr>
+      <w:r>
+        <w:rPr>
+          <w:rFonts w:ascii="Noto Serif" w:hAnsi="Noto Serif" w:eastAsia="Noto Serif"/>
+          <w:i w:val="0"/>
+          <w:color w:val="624B7D"/>
+          <w:sz w:val="16"/>
+        </w:rPr>
+        <w:t>Книжный выпуск HARVYRÐ · черновик для чтения владельцем</w:t>
       </w:r>
     </w:p>
     <w:p>
@@ -83,12 +134,12 @@
       </w:pPr>
       <w:r>
         <w:rPr>
-          <w:rFonts w:ascii="Georgia" w:hAnsi="Georgia" w:eastAsia="Georgia"/>
+          <w:rFonts w:ascii="Noto Serif" w:hAnsi="Noto Serif" w:eastAsia="Noto Serif"/>
           <w:i/>
-          <w:color w:val="278F91"/>
-          <w:sz w:val="18"/>
+          <w:color w:val="6B6270"/>
+          <w:sz w:val="14"/>
         </w:rPr>
-        <w:t>Книжный выпуск HARVYRÐ · черновик для чтения владельцем</w:t>
+        <w:t>Авторская обложечная иллюстрация: кукуруза, горы, вода и раскрытая книга; это не изображение исторического артефакта</w:t>
       </w:r>
     </w:p>
     <w:p>
@@ -99,181 +150,335 @@
     <w:p>
       <w:pPr>
         <w:pStyle w:val="Heading1"/>
+        <w:spacing w:before="100" w:after="220"/>
+        <w:ind w:firstLine="0"/>
+        <w:shd w:fill="E9EEF0"/>
+        <w:pBdr>
+          <w:left w:val="single" w:sz="18" w:space="8" w:color="B28B45"/>
+        </w:pBdr>
       </w:pPr>
       <w:r>
+        <w:rPr>
+          <w:rFonts w:ascii="Noto Sans" w:hAnsi="Noto Sans" w:eastAsia="Noto Sans"/>
+          <w:color w:val="B28B45"/>
+          <w:sz w:val="16"/>
+        </w:rPr>
+        <w:t>✦   ✧   ✦</w:t>
+        <w:br/>
+      </w:r>
+      <w:r>
+        <w:rPr>
+          <w:rFonts w:ascii="Noto Serif" w:hAnsi="Noto Serif" w:eastAsia="Noto Serif"/>
+          <w:color w:val="252B42"/>
+          <w:sz w:val="21"/>
+        </w:rPr>
         <w:t>Примечание к этому изданию</w:t>
       </w:r>
     </w:p>
     <w:p>
       <w:r>
+        <w:rPr>
+          <w:rFonts w:ascii="Noto Serif" w:hAnsi="Noto Serif" w:eastAsia="Noto Serif"/>
+          <w:color w:val="252B42"/>
+          <w:sz w:val="21"/>
+        </w:rPr>
         <w:t>Эта книга — самостоятельный русский пересказ, а не полный перевод рукописи Франсиско Хименеса и не попытка восстановить единственный утраченный «первоначальный текст». В центре рассказа — Popol Wuj, повествование K’iche’, которое известно нам через длительную устную и письменную передачу, колониальную фиксацию и множество редакций.</w:t>
       </w:r>
     </w:p>
     <w:p>
       <w:r>
+        <w:rPr>
+          <w:rFonts w:ascii="Noto Serif" w:hAnsi="Noto Serif" w:eastAsia="Noto Serif"/>
+          <w:color w:val="252B42"/>
+          <w:sz w:val="21"/>
+        </w:rPr>
         <w:t>Сохранившийся рукописный свидетель Ayer MS 1515 хранится в Newberry Library. С ним связана работа доминиканца Франсиско Хименеса: в рукописном комплексе есть текст на K’iche’, записанный латинским письмом, и испанская версия. Каталог Library of Congress датирует этот экземпляр 1700–1703 годами; Newberry описывает транскрипцию шире — 1700–1715. Это разные рамки описания, а не повод приписывать бумаге дату рождения самого повествования. Более ранние письменные формы и устные исполнения реконструируются косвенно. [Newberry] [LoC] [Harvard ReVista]</w:t>
       </w:r>
     </w:p>
     <w:p>
       <w:r>
+        <w:rPr>
+          <w:rFonts w:ascii="Noto Serif" w:hAnsi="Noto Serif" w:eastAsia="Noto Serif"/>
+          <w:color w:val="252B42"/>
+          <w:sz w:val="21"/>
+        </w:rPr>
         <w:t xml:space="preserve">В этой книге мы говорим о том, что происходит </w:t>
       </w:r>
       <w:r>
         <w:rPr>
+          <w:rFonts w:ascii="Noto Serif" w:hAnsi="Noto Serif" w:eastAsia="Noto Serif"/>
           <w:b/>
+          <w:color w:val="252B42"/>
+          <w:sz w:val="21"/>
         </w:rPr>
         <w:t>в повествовании</w:t>
       </w:r>
       <w:r>
+        <w:rPr>
+          <w:rFonts w:ascii="Noto Serif" w:hAnsi="Noto Serif" w:eastAsia="Noto Serif"/>
+          <w:color w:val="252B42"/>
+          <w:sz w:val="21"/>
+        </w:rPr>
         <w:t xml:space="preserve">, отдельно от того, что исследователи </w:t>
       </w:r>
       <w:r>
         <w:rPr>
+          <w:rFonts w:ascii="Noto Serif" w:hAnsi="Noto Serif" w:eastAsia="Noto Serif"/>
           <w:b/>
+          <w:color w:val="252B42"/>
+          <w:sz w:val="21"/>
         </w:rPr>
         <w:t>предполагают</w:t>
       </w:r>
       <w:r>
+        <w:rPr>
+          <w:rFonts w:ascii="Noto Serif" w:hAnsi="Noto Serif" w:eastAsia="Noto Serif"/>
+          <w:color w:val="252B42"/>
+          <w:sz w:val="21"/>
+        </w:rPr>
         <w:t xml:space="preserve"> о его создании и политическом контексте. Историю предков нельзя автоматически читать как перечень независимо датированных правителей, а сакральные сюжеты — как универсальное описание всех народов Maya. Там, где речь идёт о научной гипотезе или современном K’iche’ прочтении, это обозначено рядом с утверждением.</w:t>
       </w:r>
     </w:p>
     <w:p>
       <w:r>
+        <w:rPr>
+          <w:rFonts w:ascii="Noto Serif" w:hAnsi="Noto Serif" w:eastAsia="Noto Serif"/>
+          <w:color w:val="252B42"/>
+          <w:sz w:val="21"/>
+        </w:rPr>
         <w:t>Текст написан заново и не копирует современные переводы. События и имена изложены прозой; авторская разбивка на главы нужна только для удобства этого издания. Мы не имитируем устное исполнение и не выдаём собственный ритм за голос K’iche’ рассказчика. Написания Popol Wuj, K’iche’, Hunahpu, Xbalanque, Xquic и Xibalba выбраны для последовательности чтения; в других изданиях встречаются варианты.</w:t>
       </w:r>
     </w:p>
     <w:p>
       <w:r>
+        <w:rPr>
+          <w:rFonts w:ascii="Noto Serif" w:hAnsi="Noto Serif" w:eastAsia="Noto Serif"/>
+          <w:color w:val="252B42"/>
+          <w:sz w:val="21"/>
+        </w:rPr>
         <w:t>К Popol Wuj относятся с глубоким уважением многие K’iche’ и другие Maya люди. Поэтому здесь нет инструкций, реконструкций закрытых обрядов или претензии объяснить одну «религию Maya». Современные голоса и права живых сообществ не заменяются древним текстом. [Newberry] [Multepal] Перед возможной публикацией следует дополнительно сверить написания K’iche’ имён и терминов с квалифицированным специалистом или носителем языка.</w:t>
-      </w:r>
-    </w:p>
-    <w:p>
-      <w:r>
-        <w:br w:type="page"/>
       </w:r>
     </w:p>
     <w:p>
       <w:pPr>
         <w:pStyle w:val="Heading1"/>
+        <w:spacing w:before="100" w:after="220"/>
+        <w:ind w:firstLine="0"/>
+        <w:shd w:fill="E9EEF0"/>
+        <w:pBdr>
+          <w:left w:val="single" w:sz="18" w:space="8" w:color="B28B45"/>
+        </w:pBdr>
       </w:pPr>
       <w:r>
+        <w:rPr>
+          <w:rFonts w:ascii="Noto Sans" w:hAnsi="Noto Sans" w:eastAsia="Noto Sans"/>
+          <w:color w:val="B28B45"/>
+          <w:sz w:val="16"/>
+        </w:rPr>
+        <w:t>✦   ✧   ✦</w:t>
+        <w:br/>
+      </w:r>
+      <w:r>
+        <w:rPr>
+          <w:rFonts w:ascii="Noto Serif" w:hAnsi="Noto Serif" w:eastAsia="Noto Serif"/>
+          <w:color w:val="252B42"/>
+          <w:sz w:val="21"/>
+        </w:rPr>
         <w:t>Оглавление</w:t>
       </w:r>
     </w:p>
     <w:p>
       <w:pPr>
         <w:pStyle w:val="ListNumber"/>
-        <w:ind w:firstLine="0" w:left="340"/>
+        <w:spacing w:after="80"/>
+        <w:ind w:left="397" w:firstLine="0"/>
       </w:pPr>
       <w:r>
+        <w:rPr>
+          <w:rFonts w:ascii="Noto Serif" w:hAnsi="Noto Serif" w:eastAsia="Noto Serif"/>
+          <w:color w:val="247F87"/>
+          <w:sz w:val="21"/>
+        </w:rPr>
         <w:t>До того как появилась земля</w:t>
       </w:r>
     </w:p>
     <w:p>
       <w:pPr>
         <w:pStyle w:val="ListNumber"/>
-        <w:ind w:firstLine="0" w:left="340"/>
+        <w:spacing w:after="80"/>
+        <w:ind w:left="397" w:firstLine="0"/>
       </w:pPr>
       <w:r>
+        <w:rPr>
+          <w:rFonts w:ascii="Noto Serif" w:hAnsi="Noto Serif" w:eastAsia="Noto Serif"/>
+          <w:color w:val="247F87"/>
+          <w:sz w:val="21"/>
+        </w:rPr>
         <w:t>Животные и первые попытки</w:t>
       </w:r>
     </w:p>
     <w:p>
       <w:pPr>
         <w:pStyle w:val="ListNumber"/>
-        <w:ind w:firstLine="0" w:left="340"/>
+        <w:spacing w:after="80"/>
+        <w:ind w:left="397" w:firstLine="0"/>
       </w:pPr>
       <w:r>
+        <w:rPr>
+          <w:rFonts w:ascii="Noto Serif" w:hAnsi="Noto Serif" w:eastAsia="Noto Serif"/>
+          <w:color w:val="247F87"/>
+          <w:sz w:val="21"/>
+        </w:rPr>
         <w:t>Люди из жёлтой и белой кукурузы</w:t>
       </w:r>
     </w:p>
     <w:p>
       <w:pPr>
         <w:pStyle w:val="ListNumber"/>
-        <w:ind w:firstLine="0" w:left="340"/>
+        <w:spacing w:after="80"/>
+        <w:ind w:left="397" w:firstLine="0"/>
       </w:pPr>
       <w:r>
+        <w:rPr>
+          <w:rFonts w:ascii="Noto Serif" w:hAnsi="Noto Serif" w:eastAsia="Noto Serif"/>
+          <w:color w:val="247F87"/>
+          <w:sz w:val="21"/>
+        </w:rPr>
         <w:t>Старшие братья и зов Шибальбы</w:t>
       </w:r>
     </w:p>
     <w:p>
       <w:pPr>
         <w:pStyle w:val="ListNumber"/>
-        <w:ind w:firstLine="0" w:left="340"/>
+        <w:spacing w:after="80"/>
+        <w:ind w:left="397" w:firstLine="0"/>
       </w:pPr>
       <w:r>
+        <w:rPr>
+          <w:rFonts w:ascii="Noto Serif" w:hAnsi="Noto Serif" w:eastAsia="Noto Serif"/>
+          <w:color w:val="247F87"/>
+          <w:sz w:val="21"/>
+        </w:rPr>
         <w:t>Xquic у дерева калабасов</w:t>
       </w:r>
     </w:p>
     <w:p>
       <w:pPr>
         <w:pStyle w:val="ListNumber"/>
-        <w:ind w:firstLine="0" w:left="340"/>
+        <w:spacing w:after="80"/>
+        <w:ind w:left="397" w:firstLine="0"/>
       </w:pPr>
       <w:r>
+        <w:rPr>
+          <w:rFonts w:ascii="Noto Serif" w:hAnsi="Noto Serif" w:eastAsia="Noto Serif"/>
+          <w:color w:val="247F87"/>
+          <w:sz w:val="21"/>
+        </w:rPr>
         <w:t>Детство близнецов и спрятанный мяч</w:t>
       </w:r>
     </w:p>
     <w:p>
       <w:pPr>
         <w:pStyle w:val="ListNumber"/>
-        <w:ind w:firstLine="0" w:left="340"/>
+        <w:spacing w:after="80"/>
+        <w:ind w:left="397" w:firstLine="0"/>
       </w:pPr>
       <w:r>
+        <w:rPr>
+          <w:rFonts w:ascii="Noto Serif" w:hAnsi="Noto Serif" w:eastAsia="Noto Serif"/>
+          <w:color w:val="247F87"/>
+          <w:sz w:val="21"/>
+        </w:rPr>
         <w:t>Дорога в Шибальбу</w:t>
       </w:r>
     </w:p>
     <w:p>
       <w:pPr>
         <w:pStyle w:val="ListNumber"/>
-        <w:ind w:firstLine="0" w:left="340"/>
+        <w:spacing w:after="80"/>
+        <w:ind w:left="397" w:firstLine="0"/>
       </w:pPr>
       <w:r>
+        <w:rPr>
+          <w:rFonts w:ascii="Noto Serif" w:hAnsi="Noto Serif" w:eastAsia="Noto Serif"/>
+          <w:color w:val="247F87"/>
+          <w:sz w:val="21"/>
+        </w:rPr>
         <w:t>Дома испытаний</w:t>
       </w:r>
     </w:p>
     <w:p>
       <w:pPr>
         <w:pStyle w:val="ListNumber"/>
-        <w:ind w:firstLine="0" w:left="340"/>
+        <w:spacing w:after="80"/>
+        <w:ind w:left="397" w:firstLine="0"/>
       </w:pPr>
       <w:r>
+        <w:rPr>
+          <w:rFonts w:ascii="Noto Serif" w:hAnsi="Noto Serif" w:eastAsia="Noto Serif"/>
+          <w:color w:val="247F87"/>
+          <w:sz w:val="21"/>
+        </w:rPr>
         <w:t>Огонь, возвращение и финал</w:t>
       </w:r>
     </w:p>
     <w:p>
       <w:pPr>
         <w:pStyle w:val="ListNumber"/>
-        <w:ind w:firstLine="0" w:left="340"/>
+        <w:spacing w:after="80"/>
+        <w:ind w:left="397" w:firstLine="0"/>
       </w:pPr>
       <w:r>
+        <w:rPr>
+          <w:rFonts w:ascii="Noto Serif" w:hAnsi="Noto Serif" w:eastAsia="Noto Serif"/>
+          <w:color w:val="247F87"/>
+          <w:sz w:val="21"/>
+        </w:rPr>
         <w:t>Предки и дорога к земле K’iche’</w:t>
       </w:r>
     </w:p>
     <w:p>
       <w:pPr>
         <w:pStyle w:val="ListNumber"/>
-        <w:ind w:firstLine="0" w:left="340"/>
+        <w:spacing w:after="80"/>
+        <w:ind w:left="397" w:firstLine="0"/>
       </w:pPr>
       <w:r>
+        <w:rPr>
+          <w:rFonts w:ascii="Noto Serif" w:hAnsi="Noto Serif" w:eastAsia="Noto Serif"/>
+          <w:color w:val="247F87"/>
+          <w:sz w:val="21"/>
+        </w:rPr>
         <w:t>Дома, память и право на землю</w:t>
       </w:r>
     </w:p>
     <w:p>
       <w:pPr>
         <w:pStyle w:val="ListNumber"/>
-        <w:ind w:firstLine="0" w:left="340"/>
+        <w:spacing w:after="80"/>
+        <w:ind w:left="397" w:firstLine="0"/>
       </w:pPr>
       <w:r>
+        <w:rPr>
+          <w:rFonts w:ascii="Noto Serif" w:hAnsi="Noto Serif" w:eastAsia="Noto Serif"/>
+          <w:color w:val="247F87"/>
+          <w:sz w:val="21"/>
+        </w:rPr>
         <w:t>Живой язык и открытое окончание</w:t>
       </w:r>
     </w:p>
     <w:p>
       <w:pPr>
         <w:pStyle w:val="ListNumber"/>
-        <w:ind w:firstLine="0" w:left="340"/>
+        <w:spacing w:after="80"/>
+        <w:ind w:left="397" w:firstLine="0"/>
       </w:pPr>
       <w:r>
+        <w:rPr>
+          <w:rFonts w:ascii="Noto Serif" w:hAnsi="Noto Serif" w:eastAsia="Noto Serif"/>
+          <w:color w:val="247F87"/>
+          <w:sz w:val="21"/>
+        </w:rPr>
         <w:t>Краткое исследовательское приложение</w:t>
       </w:r>
     </w:p>
@@ -285,36 +490,78 @@
     <w:p>
       <w:pPr>
         <w:pStyle w:val="Heading1"/>
+        <w:spacing w:before="100" w:after="220"/>
+        <w:ind w:firstLine="0"/>
+        <w:shd w:fill="E9EEF0"/>
+        <w:pBdr>
+          <w:left w:val="single" w:sz="18" w:space="8" w:color="B28B45"/>
+        </w:pBdr>
       </w:pPr>
       <w:r>
+        <w:rPr>
+          <w:rFonts w:ascii="Noto Sans" w:hAnsi="Noto Sans" w:eastAsia="Noto Sans"/>
+          <w:color w:val="B28B45"/>
+          <w:sz w:val="16"/>
+        </w:rPr>
+        <w:t>✦   ✧   ✦</w:t>
+        <w:br/>
+      </w:r>
+      <w:r>
+        <w:rPr>
+          <w:rFonts w:ascii="Noto Serif" w:hAnsi="Noto Serif" w:eastAsia="Noto Serif"/>
+          <w:color w:val="252B42"/>
+          <w:sz w:val="21"/>
+        </w:rPr>
         <w:t>1. До того как появилась земля</w:t>
       </w:r>
     </w:p>
     <w:p>
       <w:r>
+        <w:rPr>
+          <w:rFonts w:ascii="Noto Serif" w:hAnsi="Noto Serif" w:eastAsia="Noto Serif"/>
+          <w:color w:val="252B42"/>
+          <w:sz w:val="21"/>
+        </w:rPr>
         <w:t>В начале повествования ещё нет человеческого мира в привычном смысле. Нет населённых дорог, домов и полей. Земля не оформлена так, чтобы по ней можно было пройти. Вода и тишина предшествуют обжитому пространству.</w:t>
       </w:r>
     </w:p>
     <w:p>
       <w:r>
+        <w:rPr>
+          <w:rFonts w:ascii="Noto Serif" w:hAnsi="Noto Serif" w:eastAsia="Noto Serif"/>
+          <w:color w:val="252B42"/>
+          <w:sz w:val="21"/>
+        </w:rPr>
         <w:t>Создатели советуются о том, каким должен стать мир и кто сможет в нём жить осмысленно. Это важный жест начала: мир возникает не после одиночного приказа, а после разговора и решения. Земля обретает очертания, поднимаются горы, появляются долины и русла. Речь в этом эпизоде действует как сила, способная придать миру форму. [AHA] [Smarthistory]</w:t>
       </w:r>
     </w:p>
     <w:p>
       <w:r>
+        <w:rPr>
+          <w:rFonts w:ascii="Noto Serif" w:hAnsi="Noto Serif" w:eastAsia="Noto Serif"/>
+          <w:color w:val="252B42"/>
+          <w:sz w:val="21"/>
+        </w:rPr>
         <w:t>Мы не перечисляем здесь всех имён и титулов создателей. Переводы по-разному передают их написание, число и отношения. Для одного читательского пересказа было бы слишком уверенно представить этот ряд как единую неизменную схему божеств. Важно само действие: создатели думают о мире как о месте, где должны появиться существа, способные говорить и поддерживать отношения с тем, что их окружает. [NMAI] [Newberry]</w:t>
       </w:r>
     </w:p>
     <w:p>
       <w:pPr>
-        <w:spacing w:after="100"/>
+        <w:spacing w:before="80" w:after="60"/>
+        <w:ind w:firstLine="0"/>
         <w:jc w:val="center"/>
+        <w:pBdr>
+          <w:top w:val="single" w:sz="7" w:space="5" w:color="B28B45"/>
+          <w:left w:val="single" w:sz="7" w:space="5" w:color="B28B45"/>
+          <w:bottom w:val="single" w:sz="7" w:space="5" w:color="B28B45"/>
+          <w:right w:val="single" w:sz="7" w:space="5" w:color="B28B45"/>
+        </w:pBdr>
       </w:pPr>
       <w:r>
         <w:drawing>
           <wp:inline xmlns:a="http://schemas.openxmlformats.org/drawingml/2006/main" xmlns:pic="http://schemas.openxmlformats.org/drawingml/2006/picture">
-            <wp:extent cx="3703320" cy="2468880"/>
-            <wp:docPr id="2" name="Picture 2"/>
+            <wp:extent cx="4914000" cy="3276000"/>
+            <wp:docPr id="2" name="Picture 2" descr="Авторская визуализация первой земли и животных; это не реконструкция древнего изображения" title="creation"/>
             <wp:cNvGraphicFramePr>
               <a:graphicFrameLocks noChangeAspect="1"/>
             </wp:cNvGraphicFramePr>
@@ -322,7 +569,7 @@
               <a:graphicData uri="http://schemas.openxmlformats.org/drawingml/2006/picture">
                 <pic:pic>
                   <pic:nvPicPr>
-                    <pic:cNvPr id="0" name="image.jpg"/>
+                    <pic:cNvPr id="0" name="creation.jpg"/>
                     <pic:cNvPicPr/>
                   </pic:nvPicPr>
                   <pic:blipFill>
@@ -334,7 +581,7 @@
                   <pic:spPr>
                     <a:xfrm>
                       <a:off x="0" y="0"/>
-                      <a:ext cx="3703320" cy="2468880"/>
+                      <a:ext cx="4914000" cy="3276000"/>
                     </a:xfrm>
                     <a:prstGeom prst="rect"/>
                   </pic:spPr>
@@ -347,117 +594,227 @@
     </w:p>
     <w:p>
       <w:pPr>
+        <w:spacing w:before="0" w:after="140"/>
         <w:ind w:firstLine="0"/>
         <w:jc w:val="center"/>
       </w:pPr>
       <w:r>
         <w:rPr>
-          <w:rFonts w:ascii="Georgia" w:hAnsi="Georgia" w:eastAsia="Georgia"/>
+          <w:rFonts w:ascii="Noto Serif" w:hAnsi="Noto Serif" w:eastAsia="Noto Serif"/>
           <w:i/>
-          <w:color w:val="278F91"/>
-          <w:sz w:val="18"/>
+          <w:color w:val="247F87"/>
+          <w:sz w:val="17"/>
         </w:rPr>
         <w:t>Иллюстрация передаёт настроение начальной сцены, а не исторический пейзаж или рукописный оригинал.</w:t>
       </w:r>
     </w:p>
     <w:p>
+      <w:pPr>
+        <w:spacing w:before="160" w:after="100"/>
+        <w:ind w:firstLine="0" w:left="170" w:right="113"/>
+        <w:shd w:fill="F0EDF3"/>
+        <w:pBdr>
+          <w:left w:val="single" w:sz="18" w:space="8" w:color="624B7D"/>
+        </w:pBdr>
+      </w:pPr>
       <w:r>
         <w:rPr>
+          <w:rFonts w:ascii="Noto Serif" w:hAnsi="Noto Serif" w:eastAsia="Noto Serif"/>
           <w:b/>
+          <w:color w:val="252B42"/>
+          <w:sz w:val="21"/>
         </w:rPr>
         <w:t>Источники к главе:</w:t>
       </w:r>
       <w:r>
+        <w:rPr>
+          <w:rFonts w:ascii="Noto Serif" w:hAnsi="Noto Serif" w:eastAsia="Noto Serif"/>
+          <w:color w:val="252B42"/>
+          <w:sz w:val="21"/>
+        </w:rPr>
         <w:t xml:space="preserve"> [American Historical Association] [Smarthistory / Denver Art Museum] [Smithsonian National Museum of the American Indian] [Newberry Library].</w:t>
-      </w:r>
-    </w:p>
-    <w:p>
-      <w:r>
-        <w:br w:type="page"/>
       </w:r>
     </w:p>
     <w:p>
       <w:pPr>
         <w:pStyle w:val="Heading1"/>
+        <w:spacing w:before="100" w:after="220"/>
+        <w:ind w:firstLine="0"/>
+        <w:shd w:fill="E9EEF0"/>
+        <w:pBdr>
+          <w:left w:val="single" w:sz="18" w:space="8" w:color="B28B45"/>
+        </w:pBdr>
       </w:pPr>
       <w:r>
+        <w:rPr>
+          <w:rFonts w:ascii="Noto Sans" w:hAnsi="Noto Sans" w:eastAsia="Noto Sans"/>
+          <w:color w:val="B28B45"/>
+          <w:sz w:val="16"/>
+        </w:rPr>
+        <w:t>✦   ✧   ✦</w:t>
+        <w:br/>
+      </w:r>
+      <w:r>
+        <w:rPr>
+          <w:rFonts w:ascii="Noto Serif" w:hAnsi="Noto Serif" w:eastAsia="Noto Serif"/>
+          <w:color w:val="252B42"/>
+          <w:sz w:val="21"/>
+        </w:rPr>
         <w:t>2. Животные и первые попытки</w:t>
       </w:r>
     </w:p>
     <w:p>
       <w:r>
+        <w:rPr>
+          <w:rFonts w:ascii="Noto Serif" w:hAnsi="Noto Serif" w:eastAsia="Noto Serif"/>
+          <w:color w:val="252B42"/>
+          <w:sz w:val="21"/>
+        </w:rPr>
         <w:t>Когда мир обретает места и границы, в нём появляются животные. У каждого — своя среда, свой способ двигаться и звучать. Но создатели ищут не просто жизнь. Они ждут существ, которые смогут отвечать им, помнить о них и участвовать в устройстве мира.</w:t>
       </w:r>
     </w:p>
     <w:p>
       <w:r>
+        <w:rPr>
+          <w:rFonts w:ascii="Noto Serif" w:hAnsi="Noto Serif" w:eastAsia="Noto Serif"/>
+          <w:color w:val="252B42"/>
+          <w:sz w:val="21"/>
+        </w:rPr>
         <w:t>Животные не становятся такими собеседниками. Рассказ не унижает их и не превращает в неудачные копии человека. Они остаются частью созданного мира, но не исполняют роль, о которой думают создатели. Исследовательское чтение может видеть здесь язык обязательств между разными существами; это интерпретация учёных, а не отдельная реплика персонажа. [AHA] [Christenson]</w:t>
       </w:r>
     </w:p>
     <w:p>
       <w:r>
+        <w:rPr>
+          <w:rFonts w:ascii="Noto Serif" w:hAnsi="Noto Serif" w:eastAsia="Noto Serif"/>
+          <w:color w:val="252B42"/>
+          <w:sz w:val="21"/>
+        </w:rPr>
         <w:t>Следующие попытки тоже не дают устойчивого результата. Существа из мягкой земли распадаются и не удерживают форму. Деревянные люди движутся и размножаются, но в повествовании не достигают нужной глубины речи и понимания. Эти эпизоды не следует читать как научную историю видов. Они показывают поиск способа существования, в котором телесная форма, память и способность к отношениям неразделимы. [AHA] [NMAI]</w:t>
       </w:r>
     </w:p>
     <w:p>
       <w:r>
+        <w:rPr>
+          <w:rFonts w:ascii="Noto Serif" w:hAnsi="Noto Serif" w:eastAsia="Noto Serif"/>
+          <w:color w:val="252B42"/>
+          <w:sz w:val="21"/>
+        </w:rPr>
         <w:t>Каждая попытка оставляет вопрос: что значит быть человеком в мире, где жизнь предполагает не только дыхание, но и ответ? Повествование пока не отвечает одним определением. Оно продолжает испытание.</w:t>
+      </w:r>
+    </w:p>
+    <w:p>
+      <w:pPr>
+        <w:spacing w:before="160" w:after="100"/>
+        <w:ind w:firstLine="0" w:left="170" w:right="113"/>
+        <w:shd w:fill="F0EDF3"/>
+        <w:pBdr>
+          <w:left w:val="single" w:sz="18" w:space="8" w:color="624B7D"/>
+        </w:pBdr>
+      </w:pPr>
+      <w:r>
+        <w:rPr>
+          <w:rFonts w:ascii="Noto Serif" w:hAnsi="Noto Serif" w:eastAsia="Noto Serif"/>
+          <w:b/>
+          <w:color w:val="252B42"/>
+          <w:sz w:val="21"/>
+        </w:rPr>
+        <w:t>Источники к главе:</w:t>
+      </w:r>
+      <w:r>
+        <w:rPr>
+          <w:rFonts w:ascii="Noto Serif" w:hAnsi="Noto Serif" w:eastAsia="Noto Serif"/>
+          <w:color w:val="252B42"/>
+          <w:sz w:val="21"/>
+        </w:rPr>
+        <w:t xml:space="preserve"> [American Historical Association] [Smithsonian National Museum of the American Indian] [Christenson, “Theology and Economy…”].</w:t>
+      </w:r>
+    </w:p>
+    <w:p>
+      <w:pPr>
+        <w:pStyle w:val="Heading1"/>
+        <w:spacing w:before="100" w:after="220"/>
+        <w:ind w:firstLine="0"/>
+        <w:shd w:fill="E9EEF0"/>
+        <w:pBdr>
+          <w:left w:val="single" w:sz="18" w:space="8" w:color="B28B45"/>
+        </w:pBdr>
+      </w:pPr>
+      <w:r>
+        <w:rPr>
+          <w:rFonts w:ascii="Noto Sans" w:hAnsi="Noto Sans" w:eastAsia="Noto Sans"/>
+          <w:color w:val="B28B45"/>
+          <w:sz w:val="16"/>
+        </w:rPr>
+        <w:t>✦   ✧   ✦</w:t>
+        <w:br/>
+      </w:r>
+      <w:r>
+        <w:rPr>
+          <w:rFonts w:ascii="Noto Serif" w:hAnsi="Noto Serif" w:eastAsia="Noto Serif"/>
+          <w:color w:val="252B42"/>
+          <w:sz w:val="21"/>
+        </w:rPr>
+        <w:t>3. Люди из жёлтой и белой кукурузы</w:t>
       </w:r>
     </w:p>
     <w:p>
       <w:r>
         <w:rPr>
-          <w:b/>
+          <w:rFonts w:ascii="Noto Serif" w:hAnsi="Noto Serif" w:eastAsia="Noto Serif"/>
+          <w:color w:val="252B42"/>
+          <w:sz w:val="21"/>
         </w:rPr>
-        <w:t>Источники к главе:</w:t>
-      </w:r>
-      <w:r>
-        <w:t xml:space="preserve"> [American Historical Association] [Smithsonian National Museum of the American Indian] [Christenson, “Theology and Economy…”].</w:t>
-      </w:r>
-    </w:p>
-    <w:p>
-      <w:r>
-        <w:br w:type="page"/>
-      </w:r>
-    </w:p>
-    <w:p>
-      <w:pPr>
-        <w:pStyle w:val="Heading1"/>
-      </w:pPr>
-      <w:r>
-        <w:t>3. Люди из жёлтой и белой кукурузы</w:t>
-      </w:r>
-    </w:p>
-    <w:p>
-      <w:r>
         <w:t>Затем рассказ ведёт к кукурузе. Животные указывают путь к зёрнам, из которых должны появиться новые люди. В конкретной доступной текстовой версии названы жёлтая и белая кукуруза; после её обработки вместе с водой она становится образным материалом человеческого тела. Это сюжетное описание одного K’iche’ текста, а не формула, которую можно переносить на все Maya традиции. [Purdue] [NMAI]</w:t>
       </w:r>
     </w:p>
     <w:p>
       <w:r>
+        <w:rPr>
+          <w:rFonts w:ascii="Noto Serif" w:hAnsi="Noto Serif" w:eastAsia="Noto Serif"/>
+          <w:color w:val="252B42"/>
+          <w:sz w:val="21"/>
+        </w:rPr>
         <w:t>Появляются первые четыре человека. Их зрение и знание оказываются поначалу необычайно широкими. Они видят далеко и понимают больше, чем создатели готовы им оставить. Сердце Неба ограничивает их взгляд, так что ясным становится прежде всего близкое. В рассказе это не простое наказание за любопытство: это обозначение человеческой меры, границы между людьми и создателями. [Purdue]</w:t>
       </w:r>
     </w:p>
     <w:p>
       <w:r>
+        <w:rPr>
+          <w:rFonts w:ascii="Noto Serif" w:hAnsi="Noto Serif" w:eastAsia="Noto Serif"/>
+          <w:color w:val="252B42"/>
+          <w:sz w:val="21"/>
+        </w:rPr>
         <w:t>Для современного K’iche’ комментатора, которого цитирует Национальный музей американских индейцев, кукуруза священна и связывает людей с предками, питая тело и дух. Это конкретный современный голос, а не универсальное объяснение всех представлений Maya. Мы сохраняем его именно как голос, а не превращаем в безличное правило. [NMAI]</w:t>
       </w:r>
     </w:p>
     <w:p>
       <w:r>
+        <w:rPr>
+          <w:rFonts w:ascii="Noto Serif" w:hAnsi="Noto Serif" w:eastAsia="Noto Serif"/>
+          <w:color w:val="252B42"/>
+          <w:sz w:val="21"/>
+        </w:rPr>
         <w:t>Так кукуруза в повествовании не просто продукт поля. Она стоит у начала человеческой жизни и напоминает, что люди не возникают отдельно от земли и её даров. Что именно означает эта связь в разных K’iche’ сообществах и поколениях, нельзя исчерпать одной книгой.</w:t>
       </w:r>
     </w:p>
     <w:p>
       <w:pPr>
-        <w:spacing w:after="100"/>
+        <w:spacing w:before="80" w:after="60"/>
+        <w:ind w:firstLine="0"/>
         <w:jc w:val="center"/>
+        <w:pBdr>
+          <w:top w:val="single" w:sz="7" w:space="5" w:color="B28B45"/>
+          <w:left w:val="single" w:sz="7" w:space="5" w:color="B28B45"/>
+          <w:bottom w:val="single" w:sz="7" w:space="5" w:color="B28B45"/>
+          <w:right w:val="single" w:sz="7" w:space="5" w:color="B28B45"/>
+        </w:pBdr>
       </w:pPr>
       <w:r>
         <w:drawing>
           <wp:inline xmlns:a="http://schemas.openxmlformats.org/drawingml/2006/main" xmlns:pic="http://schemas.openxmlformats.org/drawingml/2006/picture">
-            <wp:extent cx="3703320" cy="2468880"/>
-            <wp:docPr id="3" name="Picture 3"/>
+            <wp:extent cx="4914000" cy="3276000"/>
+            <wp:docPr id="3" name="Picture 3" descr="Авторская иллюстрация кукурузного поля и человеческих фигур; это не этнографическая реконструкция" title="maize"/>
             <wp:cNvGraphicFramePr>
               <a:graphicFrameLocks noChangeAspect="1"/>
             </wp:cNvGraphicFramePr>
@@ -465,7 +822,7 @@
               <a:graphicData uri="http://schemas.openxmlformats.org/drawingml/2006/picture">
                 <pic:pic>
                   <pic:nvPicPr>
-                    <pic:cNvPr id="0" name="image.jpg"/>
+                    <pic:cNvPr id="0" name="maize.jpg"/>
                     <pic:cNvPicPr/>
                   </pic:nvPicPr>
                   <pic:blipFill>
@@ -477,7 +834,7 @@
                   <pic:spPr>
                     <a:xfrm>
                       <a:off x="0" y="0"/>
-                      <a:ext cx="3703320" cy="2468880"/>
+                      <a:ext cx="4914000" cy="3276000"/>
                     </a:xfrm>
                     <a:prstGeom prst="rect"/>
                   </pic:spPr>
@@ -490,185 +847,377 @@
     </w:p>
     <w:p>
       <w:pPr>
+        <w:spacing w:before="0" w:after="140"/>
         <w:ind w:firstLine="0"/>
         <w:jc w:val="center"/>
       </w:pPr>
       <w:r>
         <w:rPr>
-          <w:rFonts w:ascii="Georgia" w:hAnsi="Georgia" w:eastAsia="Georgia"/>
+          <w:rFonts w:ascii="Noto Serif" w:hAnsi="Noto Serif" w:eastAsia="Noto Serif"/>
           <w:i/>
-          <w:color w:val="278F91"/>
-          <w:sz w:val="18"/>
+          <w:color w:val="247F87"/>
+          <w:sz w:val="17"/>
         </w:rPr>
         <w:t>Кукуруза и люди показаны как образная связь, а не документальная сцена создания.</w:t>
       </w:r>
     </w:p>
     <w:p>
+      <w:pPr>
+        <w:spacing w:before="160" w:after="100"/>
+        <w:ind w:firstLine="0" w:left="170" w:right="113"/>
+        <w:shd w:fill="F0EDF3"/>
+        <w:pBdr>
+          <w:left w:val="single" w:sz="18" w:space="8" w:color="624B7D"/>
+        </w:pBdr>
+      </w:pPr>
       <w:r>
         <w:rPr>
+          <w:rFonts w:ascii="Noto Serif" w:hAnsi="Noto Serif" w:eastAsia="Noto Serif"/>
           <w:b/>
+          <w:color w:val="252B42"/>
+          <w:sz w:val="21"/>
         </w:rPr>
         <w:t>Источники к главе:</w:t>
       </w:r>
       <w:r>
+        <w:rPr>
+          <w:rFonts w:ascii="Noto Serif" w:hAnsi="Noto Serif" w:eastAsia="Noto Serif"/>
+          <w:color w:val="252B42"/>
+          <w:sz w:val="21"/>
+        </w:rPr>
         <w:t xml:space="preserve"> [Smithsonian National Museum of the American Indian] [Purdue, текстовая версия Book 4] [Harvard ReVista].</w:t>
-      </w:r>
-    </w:p>
-    <w:p>
-      <w:r>
-        <w:br w:type="page"/>
       </w:r>
     </w:p>
     <w:p>
       <w:pPr>
         <w:pStyle w:val="Heading1"/>
+        <w:spacing w:before="100" w:after="220"/>
+        <w:ind w:firstLine="0"/>
+        <w:shd w:fill="E9EEF0"/>
+        <w:pBdr>
+          <w:left w:val="single" w:sz="18" w:space="8" w:color="B28B45"/>
+        </w:pBdr>
       </w:pPr>
       <w:r>
+        <w:rPr>
+          <w:rFonts w:ascii="Noto Sans" w:hAnsi="Noto Sans" w:eastAsia="Noto Sans"/>
+          <w:color w:val="B28B45"/>
+          <w:sz w:val="16"/>
+        </w:rPr>
+        <w:t>✦   ✧   ✦</w:t>
+        <w:br/>
+      </w:r>
+      <w:r>
+        <w:rPr>
+          <w:rFonts w:ascii="Noto Serif" w:hAnsi="Noto Serif" w:eastAsia="Noto Serif"/>
+          <w:color w:val="252B42"/>
+          <w:sz w:val="21"/>
+        </w:rPr>
         <w:t>4. Старшие братья и зов Шибальбы</w:t>
       </w:r>
     </w:p>
     <w:p>
       <w:r>
+        <w:rPr>
+          <w:rFonts w:ascii="Noto Serif" w:hAnsi="Noto Serif" w:eastAsia="Noto Serif"/>
+          <w:color w:val="252B42"/>
+          <w:sz w:val="21"/>
+        </w:rPr>
         <w:t>Дальше повествование переносит нас к игре в мяч. Старшие братья — One Hunahpu и Seven Hunahpu — играют так, что шум достигает Шибальбы, подземного мира её владык. Оттуда приходит зов: братья должны спуститься и сыграть.</w:t>
       </w:r>
     </w:p>
     <w:p>
       <w:r>
+        <w:rPr>
+          <w:rFonts w:ascii="Noto Serif" w:hAnsi="Noto Serif" w:eastAsia="Noto Serif"/>
+          <w:color w:val="252B42"/>
+          <w:sz w:val="21"/>
+        </w:rPr>
         <w:t>На дороге их ждут подмены и ловушки. Они обращаются к ложным фигурам, принимая их за настоящих хозяев. Скамья обжигает их. Затем им дают факел и сигары, которые нужно сохранить до утра; братья не справляются с условием. Владыки убивают гостей, а голову One Hunahpu помещают в крону дерева калабасов. [Mesoweb] [AHA]</w:t>
       </w:r>
     </w:p>
     <w:p>
       <w:r>
+        <w:rPr>
+          <w:rFonts w:ascii="Noto Serif" w:hAnsi="Noto Serif" w:eastAsia="Noto Serif"/>
+          <w:color w:val="252B42"/>
+          <w:sz w:val="21"/>
+        </w:rPr>
         <w:t>Это поражение не завершает историю. Голова становится частью дерева, и дерево меняется: среди его плодов уже невозможно сразу различить её. Предмет игры, путешествие и растущее дерево связывают подземный эпизод с тем, что ещё произойдёт на земле.</w:t>
       </w:r>
     </w:p>
     <w:p>
       <w:r>
+        <w:rPr>
+          <w:rFonts w:ascii="Noto Serif" w:hAnsi="Noto Serif" w:eastAsia="Noto Serif"/>
+          <w:color w:val="252B42"/>
+          <w:sz w:val="21"/>
+        </w:rPr>
         <w:t>Имена One Hunahpu и Seven Hunahpu сохраняются здесь в форме, привычной по англоязычным пересказам. Это не попытка объявить её единственно верной транслитерацией K’iche’. В этой книге мы избегаем обширных этимологических пояснений, если источники не дают для них надёжной опоры.</w:t>
+      </w:r>
+    </w:p>
+    <w:p>
+      <w:pPr>
+        <w:spacing w:before="160" w:after="100"/>
+        <w:ind w:firstLine="0" w:left="170" w:right="113"/>
+        <w:shd w:fill="F0EDF3"/>
+        <w:pBdr>
+          <w:left w:val="single" w:sz="18" w:space="8" w:color="624B7D"/>
+        </w:pBdr>
+      </w:pPr>
+      <w:r>
+        <w:rPr>
+          <w:rFonts w:ascii="Noto Serif" w:hAnsi="Noto Serif" w:eastAsia="Noto Serif"/>
+          <w:b/>
+          <w:color w:val="252B42"/>
+          <w:sz w:val="21"/>
+        </w:rPr>
+        <w:t>Источники к главе:</w:t>
+      </w:r>
+      <w:r>
+        <w:rPr>
+          <w:rFonts w:ascii="Noto Serif" w:hAnsi="Noto Serif" w:eastAsia="Noto Serif"/>
+          <w:color w:val="252B42"/>
+          <w:sz w:val="21"/>
+        </w:rPr>
+        <w:t xml:space="preserve"> [Mesoweb, “The Hero Twins”] [American Historical Association].</w:t>
+      </w:r>
+    </w:p>
+    <w:p>
+      <w:pPr>
+        <w:pStyle w:val="Heading1"/>
+        <w:spacing w:before="100" w:after="220"/>
+        <w:ind w:firstLine="0"/>
+        <w:shd w:fill="E9EEF0"/>
+        <w:pBdr>
+          <w:left w:val="single" w:sz="18" w:space="8" w:color="B28B45"/>
+        </w:pBdr>
+      </w:pPr>
+      <w:r>
+        <w:rPr>
+          <w:rFonts w:ascii="Noto Sans" w:hAnsi="Noto Sans" w:eastAsia="Noto Sans"/>
+          <w:color w:val="B28B45"/>
+          <w:sz w:val="16"/>
+        </w:rPr>
+        <w:t>✦   ✧   ✦</w:t>
+        <w:br/>
+      </w:r>
+      <w:r>
+        <w:rPr>
+          <w:rFonts w:ascii="Noto Serif" w:hAnsi="Noto Serif" w:eastAsia="Noto Serif"/>
+          <w:color w:val="252B42"/>
+          <w:sz w:val="21"/>
+        </w:rPr>
+        <w:t>5. Xquic у дерева калабасов</w:t>
       </w:r>
     </w:p>
     <w:p>
       <w:r>
         <w:rPr>
+          <w:rFonts w:ascii="Noto Serif" w:hAnsi="Noto Serif" w:eastAsia="Noto Serif"/>
+          <w:color w:val="252B42"/>
+          <w:sz w:val="21"/>
+        </w:rPr>
+        <w:t>Xquic слышит о необычном дереве и приходит посмотреть на его плоды. Там она встречается с головой One Hunahpu. Из этой встречи возникает беременность — событие, которое открывает путь младшим близнецам.</w:t>
+      </w:r>
+    </w:p>
+    <w:p>
+      <w:r>
+        <w:rPr>
+          <w:rFonts w:ascii="Noto Serif" w:hAnsi="Noto Serif" w:eastAsia="Noto Serif"/>
+          <w:color w:val="252B42"/>
+          <w:sz w:val="21"/>
+        </w:rPr>
+        <w:t>Владыки Шибальбы считают, что Xquic нарушила их власть, и требуют её казнить. Но посланные с ней совы помогают обойти приказ: вместо сердца, которое требуют предъявить, появляется древесный сок. Xquic остаётся жива и отправляется к матери погибшего One Hunahpu. Она входит в дом, который прежде не знал о её существовании, и называет себя частью его семейной истории. [Mesoweb]</w:t>
+      </w:r>
+    </w:p>
+    <w:p>
+      <w:r>
+        <w:rPr>
+          <w:rFonts w:ascii="Noto Serif" w:hAnsi="Noto Serif" w:eastAsia="Noto Serif"/>
+          <w:color w:val="252B42"/>
+          <w:sz w:val="21"/>
+        </w:rPr>
+        <w:t>Здесь важны переходы: дерево хранит след погибшего, Xquic спасает будущую жизнь, а дом становится местом встречи поколений. Мы не превращаем этот эпизод в универсальную теорию материнства или в рассказ о реальном историческом случае. Это сцена внутри конкретного повествования.</w:t>
+      </w:r>
+    </w:p>
+    <w:p>
+      <w:r>
+        <w:rPr>
+          <w:rFonts w:ascii="Noto Serif" w:hAnsi="Noto Serif" w:eastAsia="Noto Serif"/>
+          <w:color w:val="252B42"/>
+          <w:sz w:val="21"/>
+        </w:rPr>
+        <w:t>В некоторых пересказах Xquic называют Blood Woman. В этой книге мы оставляем имя Xquic и не смешиваем его с переводным эпитетом. Разные переводы могут по-разному расставлять акценты и пояснять имя; ни одно англоязычное решение само по себе не отменяет K’iche’ формы. [AHA] [Mesoweb]</w:t>
+      </w:r>
+    </w:p>
+    <w:p>
+      <w:pPr>
+        <w:spacing w:before="160" w:after="100"/>
+        <w:ind w:firstLine="0" w:left="170" w:right="113"/>
+        <w:shd w:fill="F0EDF3"/>
+        <w:pBdr>
+          <w:left w:val="single" w:sz="18" w:space="8" w:color="624B7D"/>
+        </w:pBdr>
+      </w:pPr>
+      <w:r>
+        <w:rPr>
+          <w:rFonts w:ascii="Noto Serif" w:hAnsi="Noto Serif" w:eastAsia="Noto Serif"/>
           <w:b/>
+          <w:color w:val="252B42"/>
+          <w:sz w:val="21"/>
         </w:rPr>
         <w:t>Источники к главе:</w:t>
       </w:r>
       <w:r>
+        <w:rPr>
+          <w:rFonts w:ascii="Noto Serif" w:hAnsi="Noto Serif" w:eastAsia="Noto Serif"/>
+          <w:color w:val="252B42"/>
+          <w:sz w:val="21"/>
+        </w:rPr>
         <w:t xml:space="preserve"> [Mesoweb, “The Hero Twins”] [American Historical Association].</w:t>
-      </w:r>
-    </w:p>
-    <w:p>
-      <w:r>
-        <w:br w:type="page"/>
       </w:r>
     </w:p>
     <w:p>
       <w:pPr>
         <w:pStyle w:val="Heading1"/>
+        <w:spacing w:before="100" w:after="220"/>
+        <w:ind w:firstLine="0"/>
+        <w:shd w:fill="E9EEF0"/>
+        <w:pBdr>
+          <w:left w:val="single" w:sz="18" w:space="8" w:color="B28B45"/>
+        </w:pBdr>
       </w:pPr>
       <w:r>
-        <w:t>5. Xquic у дерева калабасов</w:t>
+        <w:rPr>
+          <w:rFonts w:ascii="Noto Sans" w:hAnsi="Noto Sans" w:eastAsia="Noto Sans"/>
+          <w:color w:val="B28B45"/>
+          <w:sz w:val="16"/>
+        </w:rPr>
+        <w:t>✦   ✧   ✦</w:t>
+        <w:br/>
       </w:r>
-    </w:p>
-    <w:p>
       <w:r>
-        <w:t>Xquic слышит о необычном дереве и приходит посмотреть на его плоды. Там она встречается с головой One Hunahpu. Из этой встречи возникает беременность — событие, которое открывает путь младшим близнецам.</w:t>
-      </w:r>
-    </w:p>
-    <w:p>
-      <w:r>
-        <w:t>Владыки Шибальбы считают, что Xquic нарушила их власть, и требуют её казнить. Но посланные с ней совы помогают обойти приказ: вместо сердца, которое требуют предъявить, появляется древесный сок. Xquic остаётся жива и отправляется к матери погибшего One Hunahpu. Она входит в дом, который прежде не знал о её существовании, и называет себя частью его семейной истории. [Mesoweb]</w:t>
-      </w:r>
-    </w:p>
-    <w:p>
-      <w:r>
-        <w:t>Здесь важны переходы: дерево хранит след погибшего, Xquic спасает будущую жизнь, а дом становится местом встречи поколений. Мы не превращаем этот эпизод в универсальную теорию материнства или в рассказ о реальном историческом случае. Это сцена внутри конкретного повествования.</w:t>
-      </w:r>
-    </w:p>
-    <w:p>
-      <w:r>
-        <w:t>В некоторых пересказах Xquic называют Blood Woman. В этой книге мы оставляем имя Xquic и не смешиваем его с переводным эпитетом. Разные переводы могут по-разному расставлять акценты и пояснять имя; ни одно англоязычное решение само по себе не отменяет K’iche’ формы. [AHA] [Mesoweb]</w:t>
+        <w:rPr>
+          <w:rFonts w:ascii="Noto Serif" w:hAnsi="Noto Serif" w:eastAsia="Noto Serif"/>
+          <w:color w:val="252B42"/>
+          <w:sz w:val="21"/>
+        </w:rPr>
+        <w:t>6. Детство близнецов и спрятанный мяч</w:t>
       </w:r>
     </w:p>
     <w:p>
       <w:r>
         <w:rPr>
+          <w:rFonts w:ascii="Noto Serif" w:hAnsi="Noto Serif" w:eastAsia="Noto Serif"/>
+          <w:color w:val="252B42"/>
+          <w:sz w:val="21"/>
+        </w:rPr>
+        <w:t>Xquic рождает Hunahpu и Xbalanque. Они растут рядом с бабушкой и старшими родственниками. Дом не встречает их безусловно: близнецов отталкивают, а их старшие кузены соперничают с ними. В ответ младшие братья прибегают к хитрости, и кузены оказываются превращены в обезьян. [Mesoweb] [AHA]</w:t>
+      </w:r>
+    </w:p>
+    <w:p>
+      <w:r>
+        <w:rPr>
+          <w:rFonts w:ascii="Noto Serif" w:hAnsi="Noto Serif" w:eastAsia="Noto Serif"/>
+          <w:color w:val="252B42"/>
+          <w:sz w:val="21"/>
+        </w:rPr>
+        <w:t>Затем близнецы пытаются расчистить поле, но работа будто не держится: на следующий день участок снова зарос. Их помощниками становятся животные. Пойманная крыса рассказывает о спрятанном мяче и снаряжении их отцов. Предметы лежат высоко, под крышей, где их не достали раньше.</w:t>
+      </w:r>
+    </w:p>
+    <w:p>
+      <w:r>
+        <w:rPr>
+          <w:rFonts w:ascii="Noto Serif" w:hAnsi="Noto Serif" w:eastAsia="Noto Serif"/>
+          <w:color w:val="252B42"/>
+          <w:sz w:val="21"/>
+        </w:rPr>
+        <w:t>Чтобы вынуть их, братья отвлекают взрослых и действуют вместе. Когда мяч снова ударяет о землю, игра звучит так, что её слышат в Шибальбе. Владыки понимают: история старших братьев повторяется — но на этот раз к ним идут другие игроки.</w:t>
+      </w:r>
+    </w:p>
+    <w:p>
+      <w:r>
+        <w:rPr>
+          <w:rFonts w:ascii="Noto Serif" w:hAnsi="Noto Serif" w:eastAsia="Noto Serif"/>
+          <w:color w:val="252B42"/>
+          <w:sz w:val="21"/>
+        </w:rPr>
+        <w:t>Мяч здесь не просто спортивный предмет. В структуре рассказа он переносит наследие между поколениями. Близнецы не получают готового рассказа о своих отцах; они находят их след через вещи, совет животных и собственное действие. Это литературный вывод о последовательности эпизодов, а не универсальная мораль текста.</w:t>
+      </w:r>
+    </w:p>
+    <w:p>
+      <w:pPr>
+        <w:spacing w:before="160" w:after="100"/>
+        <w:ind w:firstLine="0" w:left="170" w:right="113"/>
+        <w:shd w:fill="F0EDF3"/>
+        <w:pBdr>
+          <w:left w:val="single" w:sz="18" w:space="8" w:color="624B7D"/>
+        </w:pBdr>
+      </w:pPr>
+      <w:r>
+        <w:rPr>
+          <w:rFonts w:ascii="Noto Serif" w:hAnsi="Noto Serif" w:eastAsia="Noto Serif"/>
           <w:b/>
+          <w:color w:val="252B42"/>
+          <w:sz w:val="21"/>
         </w:rPr>
         <w:t>Источники к главе:</w:t>
       </w:r>
       <w:r>
+        <w:rPr>
+          <w:rFonts w:ascii="Noto Serif" w:hAnsi="Noto Serif" w:eastAsia="Noto Serif"/>
+          <w:color w:val="252B42"/>
+          <w:sz w:val="21"/>
+        </w:rPr>
         <w:t xml:space="preserve"> [Mesoweb, “The Hero Twins”] [American Historical Association].</w:t>
-      </w:r>
-    </w:p>
-    <w:p>
-      <w:r>
-        <w:br w:type="page"/>
       </w:r>
     </w:p>
     <w:p>
       <w:pPr>
         <w:pStyle w:val="Heading1"/>
+        <w:spacing w:before="100" w:after="220"/>
+        <w:ind w:firstLine="0"/>
+        <w:shd w:fill="E9EEF0"/>
+        <w:pBdr>
+          <w:left w:val="single" w:sz="18" w:space="8" w:color="B28B45"/>
+        </w:pBdr>
       </w:pPr>
       <w:r>
-        <w:t>6. Детство близнецов и спрятанный мяч</w:t>
+        <w:rPr>
+          <w:rFonts w:ascii="Noto Sans" w:hAnsi="Noto Sans" w:eastAsia="Noto Sans"/>
+          <w:color w:val="B28B45"/>
+          <w:sz w:val="16"/>
+        </w:rPr>
+        <w:t>✦   ✧   ✦</w:t>
+        <w:br/>
       </w:r>
-    </w:p>
-    <w:p>
-      <w:r>
-        <w:t>Xquic рождает Hunahpu и Xbalanque. Они растут рядом с бабушкой и старшими родственниками. Дом не встречает их безусловно: близнецов отталкивают, а их старшие кузены соперничают с ними. В ответ младшие братья прибегают к хитрости, и кузены оказываются превращены в обезьян. [Mesoweb] [AHA]</w:t>
-      </w:r>
-    </w:p>
-    <w:p>
-      <w:r>
-        <w:t>Затем близнецы пытаются расчистить поле, но работа будто не держится: на следующий день участок снова зарос. Их помощниками становятся животные. Пойманная крыса рассказывает о спрятанном мяче и снаряжении их отцов. Предметы лежат высоко, под крышей, где их не достали раньше.</w:t>
-      </w:r>
-    </w:p>
-    <w:p>
-      <w:r>
-        <w:t>Чтобы вынуть их, братья отвлекают взрослых и действуют вместе. Когда мяч снова ударяет о землю, игра звучит так, что её слышат в Шибальбе. Владыки понимают: история старших братьев повторяется — но на этот раз к ним идут другие игроки.</w:t>
-      </w:r>
-    </w:p>
-    <w:p>
-      <w:r>
-        <w:t>Мяч здесь не просто спортивный предмет. В структуре рассказа он переносит наследие между поколениями. Близнецы не получают готового рассказа о своих отцах; они находят их след через вещи, совет животных и собственное действие. Это литературный вывод о последовательности эпизодов, а не универсальная мораль текста.</w:t>
-      </w:r>
-    </w:p>
-    <w:p>
       <w:r>
         <w:rPr>
-          <w:b/>
+          <w:rFonts w:ascii="Noto Serif" w:hAnsi="Noto Serif" w:eastAsia="Noto Serif"/>
+          <w:color w:val="252B42"/>
+          <w:sz w:val="21"/>
         </w:rPr>
-        <w:t>Источники к главе:</w:t>
-      </w:r>
-      <w:r>
-        <w:t xml:space="preserve"> [Mesoweb, “The Hero Twins”] [American Historical Association].</w:t>
-      </w:r>
-    </w:p>
-    <w:p>
-      <w:r>
-        <w:br w:type="page"/>
-      </w:r>
-    </w:p>
-    <w:p>
-      <w:pPr>
-        <w:pStyle w:val="Heading1"/>
-      </w:pPr>
-      <w:r>
         <w:t>7. Дорога в Шибальбу</w:t>
       </w:r>
     </w:p>
     <w:p>
       <w:pPr>
-        <w:spacing w:after="100"/>
+        <w:spacing w:before="80" w:after="60"/>
+        <w:ind w:firstLine="0"/>
         <w:jc w:val="center"/>
+        <w:pBdr>
+          <w:top w:val="single" w:sz="7" w:space="5" w:color="B28B45"/>
+          <w:left w:val="single" w:sz="7" w:space="5" w:color="B28B45"/>
+          <w:bottom w:val="single" w:sz="7" w:space="5" w:color="B28B45"/>
+          <w:right w:val="single" w:sz="7" w:space="5" w:color="B28B45"/>
+        </w:pBdr>
       </w:pPr>
       <w:r>
         <w:drawing>
           <wp:inline xmlns:a="http://schemas.openxmlformats.org/drawingml/2006/main" xmlns:pic="http://schemas.openxmlformats.org/drawingml/2006/picture">
-            <wp:extent cx="3703320" cy="2468880"/>
-            <wp:docPr id="4" name="Picture 4"/>
+            <wp:extent cx="4914000" cy="3276000"/>
+            <wp:docPr id="4" name="Picture 4" descr="Авторская иллюстрация близнецов у входа в тёмную долину; это художественная визуализация, не реконструкция обряда или археологического объекта" title="twins"/>
             <wp:cNvGraphicFramePr>
               <a:graphicFrameLocks noChangeAspect="1"/>
             </wp:cNvGraphicFramePr>
@@ -676,7 +1225,7 @@
               <a:graphicData uri="http://schemas.openxmlformats.org/drawingml/2006/picture">
                 <pic:pic>
                   <pic:nvPicPr>
-                    <pic:cNvPr id="0" name="image.jpg"/>
+                    <pic:cNvPr id="0" name="twins.jpg"/>
                     <pic:cNvPicPr/>
                   </pic:nvPicPr>
                   <pic:blipFill>
@@ -688,7 +1237,7 @@
                   <pic:spPr>
                     <a:xfrm>
                       <a:off x="0" y="0"/>
-                      <a:ext cx="3703320" cy="2468880"/>
+                      <a:ext cx="4914000" cy="3276000"/>
                     </a:xfrm>
                     <a:prstGeom prst="rect"/>
                   </pic:spPr>
@@ -701,176 +1250,352 @@
     </w:p>
     <w:p>
       <w:pPr>
+        <w:spacing w:before="0" w:after="140"/>
         <w:ind w:firstLine="0"/>
         <w:jc w:val="center"/>
       </w:pPr>
       <w:r>
         <w:rPr>
-          <w:rFonts w:ascii="Georgia" w:hAnsi="Georgia" w:eastAsia="Georgia"/>
+          <w:rFonts w:ascii="Noto Serif" w:hAnsi="Noto Serif" w:eastAsia="Noto Serif"/>
           <w:i/>
-          <w:color w:val="278F91"/>
-          <w:sz w:val="18"/>
+          <w:color w:val="247F87"/>
+          <w:sz w:val="17"/>
         </w:rPr>
         <w:t>Близнецы и мяч показаны как персонажи повествования; архитектурный образ не утверждает конкретное место действия.</w:t>
       </w:r>
     </w:p>
     <w:p>
       <w:r>
+        <w:rPr>
+          <w:rFonts w:ascii="Noto Serif" w:hAnsi="Noto Serif" w:eastAsia="Noto Serif"/>
+          <w:color w:val="252B42"/>
+          <w:sz w:val="21"/>
+        </w:rPr>
         <w:t>Hunahpu и Xbalanque отправляются туда, где погибли их отцы. Они не идут вслепую. Дорога разветвляется, реки и перекрёстки проверяют путника; братья выбирают путь, который позволяет им не повторить прежние ошибки.</w:t>
       </w:r>
     </w:p>
     <w:p>
       <w:r>
+        <w:rPr>
+          <w:rFonts w:ascii="Noto Serif" w:hAnsi="Noto Serif" w:eastAsia="Noto Serif"/>
+          <w:color w:val="252B42"/>
+          <w:sz w:val="21"/>
+        </w:rPr>
         <w:t>Первый обман — приветствовать деревянные изображения, будто это владыки. Близнецы не попадаются на него. Затем они сталкиваются с сидящими в зале фигурами, часть которых снова лишь подобие. Москит кусает тех, кто должен быть назван по имени. По их реакции братья узнают, кто действительно присутствует. [Mesoweb]</w:t>
       </w:r>
     </w:p>
     <w:p>
       <w:r>
+        <w:rPr>
+          <w:rFonts w:ascii="Noto Serif" w:hAnsi="Noto Serif" w:eastAsia="Noto Serif"/>
+          <w:color w:val="252B42"/>
+          <w:sz w:val="21"/>
+        </w:rPr>
         <w:t>Обнаружив настоящих владык, близнецы приветствуют их правильно и не садятся на обжигающую скамью. Испытание пройдено не силой, а вниманием: они проверяют, что видят, слушают и называют. Повествование ставит рядом наблюдательность и уважительное обращение — но не превращает сцену в практическое руководство или предписание для читателя.</w:t>
       </w:r>
     </w:p>
     <w:p>
       <w:r>
+        <w:rPr>
+          <w:rFonts w:ascii="Noto Serif" w:hAnsi="Noto Serif" w:eastAsia="Noto Serif"/>
+          <w:color w:val="252B42"/>
+          <w:sz w:val="21"/>
+        </w:rPr>
         <w:t>Шибальба встречает их как место, где порядок нарочно подменён. Каждая вещь может оказаться ловушкой. Каждый ответ требует не только смелости, но и проверки.</w:t>
+      </w:r>
+    </w:p>
+    <w:p>
+      <w:pPr>
+        <w:spacing w:before="160" w:after="100"/>
+        <w:ind w:firstLine="0" w:left="170" w:right="113"/>
+        <w:shd w:fill="F0EDF3"/>
+        <w:pBdr>
+          <w:left w:val="single" w:sz="18" w:space="8" w:color="624B7D"/>
+        </w:pBdr>
+      </w:pPr>
+      <w:r>
+        <w:rPr>
+          <w:rFonts w:ascii="Noto Serif" w:hAnsi="Noto Serif" w:eastAsia="Noto Serif"/>
+          <w:b/>
+          <w:color w:val="252B42"/>
+          <w:sz w:val="21"/>
+        </w:rPr>
+        <w:t>Источники к главе:</w:t>
+      </w:r>
+      <w:r>
+        <w:rPr>
+          <w:rFonts w:ascii="Noto Serif" w:hAnsi="Noto Serif" w:eastAsia="Noto Serif"/>
+          <w:color w:val="252B42"/>
+          <w:sz w:val="21"/>
+        </w:rPr>
+        <w:t xml:space="preserve"> [Mesoweb, “The Hero Twins”] [American Historical Association].</w:t>
+      </w:r>
+    </w:p>
+    <w:p>
+      <w:pPr>
+        <w:pStyle w:val="Heading1"/>
+        <w:spacing w:before="100" w:after="220"/>
+        <w:ind w:firstLine="0"/>
+        <w:shd w:fill="E9EEF0"/>
+        <w:pBdr>
+          <w:left w:val="single" w:sz="18" w:space="8" w:color="B28B45"/>
+        </w:pBdr>
+      </w:pPr>
+      <w:r>
+        <w:rPr>
+          <w:rFonts w:ascii="Noto Sans" w:hAnsi="Noto Sans" w:eastAsia="Noto Sans"/>
+          <w:color w:val="B28B45"/>
+          <w:sz w:val="16"/>
+        </w:rPr>
+        <w:t>✦   ✧   ✦</w:t>
+        <w:br/>
+      </w:r>
+      <w:r>
+        <w:rPr>
+          <w:rFonts w:ascii="Noto Serif" w:hAnsi="Noto Serif" w:eastAsia="Noto Serif"/>
+          <w:color w:val="252B42"/>
+          <w:sz w:val="21"/>
+        </w:rPr>
+        <w:t>8. Дома испытаний</w:t>
       </w:r>
     </w:p>
     <w:p>
       <w:r>
         <w:rPr>
+          <w:rFonts w:ascii="Noto Serif" w:hAnsi="Noto Serif" w:eastAsia="Noto Serif"/>
+          <w:color w:val="252B42"/>
+          <w:sz w:val="21"/>
+        </w:rPr>
+        <w:t>Владыки требуют, чтобы братья выдержали ряд испытаний в специальных домах. В повествовательных пересказах названы Дом Бритв, Холодный дом, Дом Ягуаров, Огненный дом и Дом Летучих мышей. Это не каталог реальных церемоний; это последовательность испытаний внутри истории. [Mesoweb]</w:t>
+      </w:r>
+    </w:p>
+    <w:p>
+      <w:r>
+        <w:rPr>
+          <w:rFonts w:ascii="Noto Serif" w:hAnsi="Noto Serif" w:eastAsia="Noto Serif"/>
+          <w:color w:val="252B42"/>
+          <w:sz w:val="21"/>
+        </w:rPr>
+        <w:t>Каждый дом проверяет иной предел. В одном грозит острая сталь. В другом — холод. Затем появляются ягуары и огонь. Братья находят способы пережить опасность, используя помощь друг друга и животных, которые включаются в их путь. Испытания отличаются, но общий узор повторяется: Шибальба хочет, чтобы гости приняли навязанные условия за неизбежные; близнецы ищут в них слабое место.</w:t>
+      </w:r>
+    </w:p>
+    <w:p>
+      <w:r>
+        <w:rPr>
+          <w:rFonts w:ascii="Noto Serif" w:hAnsi="Noto Serif" w:eastAsia="Noto Serif"/>
+          <w:color w:val="252B42"/>
+          <w:sz w:val="21"/>
+        </w:rPr>
+        <w:t>Самое опасное испытание ждёт их среди летучих мышей. Hunahpu скрывается в духовой трубке, но, высунувшись, теряет голову. Xbalanque не бросает брата. Он временно заменяет голову плодом и использует ситуацию так, чтобы вернуть настоящую на место. История опять связывает поражение с восстановлением — хотя оно не гарантировано и требует точного действия. [Mesoweb]</w:t>
+      </w:r>
+    </w:p>
+    <w:p>
+      <w:r>
+        <w:rPr>
+          <w:rFonts w:ascii="Noto Serif" w:hAnsi="Noto Serif" w:eastAsia="Noto Serif"/>
+          <w:color w:val="252B42"/>
+          <w:sz w:val="21"/>
+        </w:rPr>
+        <w:t>Мы не добавляем к этому эпизоду готовую формулу вроде «добро всегда побеждает». В повествовании успех близнецов зависит от конкретного знания, верных помощников и умения не действовать по правилам, навязанным врагом. Любая более широкая мораль была бы уже интерпретацией.</w:t>
+      </w:r>
+    </w:p>
+    <w:p>
+      <w:pPr>
+        <w:spacing w:before="160" w:after="100"/>
+        <w:ind w:firstLine="0" w:left="170" w:right="113"/>
+        <w:shd w:fill="F0EDF3"/>
+        <w:pBdr>
+          <w:left w:val="single" w:sz="18" w:space="8" w:color="624B7D"/>
+        </w:pBdr>
+      </w:pPr>
+      <w:r>
+        <w:rPr>
+          <w:rFonts w:ascii="Noto Serif" w:hAnsi="Noto Serif" w:eastAsia="Noto Serif"/>
           <w:b/>
+          <w:color w:val="252B42"/>
+          <w:sz w:val="21"/>
         </w:rPr>
         <w:t>Источники к главе:</w:t>
       </w:r>
       <w:r>
+        <w:rPr>
+          <w:rFonts w:ascii="Noto Serif" w:hAnsi="Noto Serif" w:eastAsia="Noto Serif"/>
+          <w:color w:val="252B42"/>
+          <w:sz w:val="21"/>
+        </w:rPr>
         <w:t xml:space="preserve"> [Mesoweb, “The Hero Twins”] [American Historical Association].</w:t>
-      </w:r>
-    </w:p>
-    <w:p>
-      <w:r>
-        <w:br w:type="page"/>
       </w:r>
     </w:p>
     <w:p>
       <w:pPr>
         <w:pStyle w:val="Heading1"/>
+        <w:spacing w:before="100" w:after="220"/>
+        <w:ind w:firstLine="0"/>
+        <w:shd w:fill="E9EEF0"/>
+        <w:pBdr>
+          <w:left w:val="single" w:sz="18" w:space="8" w:color="B28B45"/>
+        </w:pBdr>
       </w:pPr>
       <w:r>
-        <w:t>8. Дома испытаний</w:t>
+        <w:rPr>
+          <w:rFonts w:ascii="Noto Sans" w:hAnsi="Noto Sans" w:eastAsia="Noto Sans"/>
+          <w:color w:val="B28B45"/>
+          <w:sz w:val="16"/>
+        </w:rPr>
+        <w:t>✦   ✧   ✦</w:t>
+        <w:br/>
       </w:r>
-    </w:p>
-    <w:p>
       <w:r>
-        <w:t>Владыки требуют, чтобы братья выдержали ряд испытаний в специальных домах. В повествовательных пересказах названы Дом Бритв, Холодный дом, Дом Ягуаров, Огненный дом и Дом Летучих мышей. Это не каталог реальных церемоний; это последовательность испытаний внутри истории. [Mesoweb]</w:t>
-      </w:r>
-    </w:p>
-    <w:p>
-      <w:r>
-        <w:t>Каждый дом проверяет иной предел. В одном грозит острая сталь. В другом — холод. Затем появляются ягуары и огонь. Братья находят способы пережить опасность, используя помощь друг друга и животных, которые включаются в их путь. Испытания отличаются, но общий узор повторяется: Шибальба хочет, чтобы гости приняли навязанные условия за неизбежные; близнецы ищут в них слабое место.</w:t>
-      </w:r>
-    </w:p>
-    <w:p>
-      <w:r>
-        <w:t>Самое опасное испытание ждёт их среди летучих мышей. Hunahpu скрывается в духовой трубке, но, высунувшись, теряет голову. Xbalanque не бросает брата. Он временно заменяет голову плодом и использует ситуацию так, чтобы вернуть настоящую на место. История опять связывает поражение с восстановлением — хотя оно не гарантировано и требует точного действия. [Mesoweb]</w:t>
-      </w:r>
-    </w:p>
-    <w:p>
-      <w:r>
-        <w:t>Мы не добавляем к этому эпизоду готовую формулу вроде «добро всегда побеждает». В повествовании успех близнецов зависит от конкретного знания, верных помощников и умения не действовать по правилам, навязанным врагом. Любая более широкая мораль была бы уже интерпретацией.</w:t>
+        <w:rPr>
+          <w:rFonts w:ascii="Noto Serif" w:hAnsi="Noto Serif" w:eastAsia="Noto Serif"/>
+          <w:color w:val="252B42"/>
+          <w:sz w:val="21"/>
+        </w:rPr>
+        <w:t>9. Огонь, возвращение и финал</w:t>
       </w:r>
     </w:p>
     <w:p>
       <w:r>
         <w:rPr>
+          <w:rFonts w:ascii="Noto Serif" w:hAnsi="Noto Serif" w:eastAsia="Noto Serif"/>
+          <w:color w:val="252B42"/>
+          <w:sz w:val="21"/>
+        </w:rPr>
+        <w:t>Пройдя дома, близнецы принимают вызов, который нельзя пережить обычным способом. Они входят в огонь и погибают. Владыки измельчают их кости и бросают их в реку. Но на этом рассказ не останавливается: братья возвращаются сначала в рыбьем облике, затем — как странствующие исполнители, показывающие необычные представления. [Mesoweb]</w:t>
+      </w:r>
+    </w:p>
+    <w:p>
+      <w:r>
+        <w:rPr>
+          <w:rFonts w:ascii="Noto Serif" w:hAnsi="Noto Serif" w:eastAsia="Noto Serif"/>
+          <w:color w:val="252B42"/>
+          <w:sz w:val="21"/>
+        </w:rPr>
+        <w:t>Владыки приглашают незнакомцев показать свои способности. Те изображают разрушение и восстановление, смерть и возвращение. Увидев это, хозяева просят испытать трюк на них. Близнецы убивают двух главных владык, но не возвращают их. Обманчивая власть Шибальбы теряет опору. [Mesoweb] [NMAI]</w:t>
+      </w:r>
+    </w:p>
+    <w:p>
+      <w:r>
+        <w:rPr>
+          <w:rFonts w:ascii="Noto Serif" w:hAnsi="Noto Serif" w:eastAsia="Noto Serif"/>
+          <w:color w:val="252B42"/>
+          <w:sz w:val="21"/>
+        </w:rPr>
+        <w:t>Финальные детали в пересказах могут различаться. В музейном изложении Smithsonian NMAI и в пересказе Mesoweb близнецы восходят как солнце и луна; Mesoweb также связывает One Hunahpu с кукурузой. Мы передаём это как содержание конкретных современных изложений, а не как бесспорную астрономическую или религиоведческую формулу. [NMAI] [Mesoweb]</w:t>
+      </w:r>
+    </w:p>
+    <w:p>
+      <w:r>
+        <w:rPr>
+          <w:rFonts w:ascii="Noto Serif" w:hAnsi="Noto Serif" w:eastAsia="Noto Serif"/>
+          <w:color w:val="252B42"/>
+          <w:sz w:val="21"/>
+        </w:rPr>
+        <w:t>Так завершается путь через подземный мир, но не вся книга. Поздние части обращают внимание на предков K’iche’, их странствия, линии власти и память о земле. Герои возвращают будущее не только себе: их история соединяется с историей сообщества.</w:t>
+      </w:r>
+    </w:p>
+    <w:p>
+      <w:pPr>
+        <w:spacing w:before="160" w:after="100"/>
+        <w:ind w:firstLine="0" w:left="170" w:right="113"/>
+        <w:shd w:fill="F0EDF3"/>
+        <w:pBdr>
+          <w:left w:val="single" w:sz="18" w:space="8" w:color="624B7D"/>
+        </w:pBdr>
+      </w:pPr>
+      <w:r>
+        <w:rPr>
+          <w:rFonts w:ascii="Noto Serif" w:hAnsi="Noto Serif" w:eastAsia="Noto Serif"/>
           <w:b/>
+          <w:color w:val="252B42"/>
+          <w:sz w:val="21"/>
         </w:rPr>
         <w:t>Источники к главе:</w:t>
       </w:r>
       <w:r>
-        <w:t xml:space="preserve"> [Mesoweb, “The Hero Twins”] [American Historical Association].</w:t>
-      </w:r>
-    </w:p>
-    <w:p>
-      <w:r>
-        <w:br w:type="page"/>
+        <w:rPr>
+          <w:rFonts w:ascii="Noto Serif" w:hAnsi="Noto Serif" w:eastAsia="Noto Serif"/>
+          <w:color w:val="252B42"/>
+          <w:sz w:val="21"/>
+        </w:rPr>
+        <w:t xml:space="preserve"> [Mesoweb, “The Hero Twins”] [Smithsonian National Museum of the American Indian] [American Historical Association].</w:t>
       </w:r>
     </w:p>
     <w:p>
       <w:pPr>
         <w:pStyle w:val="Heading1"/>
+        <w:spacing w:before="100" w:after="220"/>
+        <w:ind w:firstLine="0"/>
+        <w:shd w:fill="E9EEF0"/>
+        <w:pBdr>
+          <w:left w:val="single" w:sz="18" w:space="8" w:color="B28B45"/>
+        </w:pBdr>
       </w:pPr>
       <w:r>
-        <w:t>9. Огонь, возвращение и финал</w:t>
+        <w:rPr>
+          <w:rFonts w:ascii="Noto Sans" w:hAnsi="Noto Sans" w:eastAsia="Noto Sans"/>
+          <w:color w:val="B28B45"/>
+          <w:sz w:val="16"/>
+        </w:rPr>
+        <w:t>✦   ✧   ✦</w:t>
+        <w:br/>
       </w:r>
-    </w:p>
-    <w:p>
       <w:r>
-        <w:t>Пройдя дома, близнецы принимают вызов, который нельзя пережить обычным способом. Они входят в огонь и погибают. Владыки измельчают их кости и бросают их в реку. Но на этом рассказ не останавливается: братья возвращаются сначала в рыбьем облике, затем — как странствующие исполнители, показывающие необычные представления. [Mesoweb]</w:t>
-      </w:r>
-    </w:p>
-    <w:p>
-      <w:r>
-        <w:t>Владыки приглашают незнакомцев показать свои способности. Те изображают разрушение и восстановление, смерть и возвращение. Увидев это, хозяева просят испытать трюк на них. Близнецы убивают двух главных владык, но не возвращают их. Обманчивая власть Шибальбы теряет опору. [Mesoweb] [NMAI]</w:t>
-      </w:r>
-    </w:p>
-    <w:p>
-      <w:r>
-        <w:t>Финальные детали в пересказах могут различаться. В музейном изложении Smithsonian NMAI и в пересказе Mesoweb близнецы восходят как солнце и луна; Mesoweb также связывает One Hunahpu с кукурузой. Мы передаём это как содержание конкретных современных изложений, а не как бесспорную астрономическую или религиоведческую формулу. [NMAI] [Mesoweb]</w:t>
-      </w:r>
-    </w:p>
-    <w:p>
-      <w:r>
-        <w:t>Так завершается путь через подземный мир, но не вся книга. Поздние части обращают внимание на предков K’iche’, их странствия, линии власти и память о земле. Герои возвращают будущее не только себе: их история соединяется с историей сообщества.</w:t>
+        <w:rPr>
+          <w:rFonts w:ascii="Noto Serif" w:hAnsi="Noto Serif" w:eastAsia="Noto Serif"/>
+          <w:color w:val="252B42"/>
+          <w:sz w:val="21"/>
+        </w:rPr>
+        <w:t>10. Предки и дорога к земле K’iche’</w:t>
       </w:r>
     </w:p>
     <w:p>
       <w:r>
         <w:rPr>
-          <w:b/>
+          <w:rFonts w:ascii="Noto Serif" w:hAnsi="Noto Serif" w:eastAsia="Noto Serif"/>
+          <w:color w:val="252B42"/>
+          <w:sz w:val="21"/>
         </w:rPr>
-        <w:t>Источники к главе:</w:t>
-      </w:r>
-      <w:r>
-        <w:t xml:space="preserve"> [Mesoweb, “The Hero Twins”] [Smithsonian National Museum of the American Indian] [American Historical Association].</w:t>
-      </w:r>
-    </w:p>
-    <w:p>
-      <w:r>
-        <w:br w:type="page"/>
-      </w:r>
-    </w:p>
-    <w:p>
-      <w:pPr>
-        <w:pStyle w:val="Heading1"/>
-      </w:pPr>
-      <w:r>
-        <w:t>10. Предки и дорога к земле K’iche’</w:t>
-      </w:r>
-    </w:p>
-    <w:p>
-      <w:r>
         <w:t>После историй о создании и близнецах повествование переходит к предкам K’iche’ и движению к землям, которые называются K’iche’. Оно рассказывает о происхождении, странствиях и возникновении порядка. Это не современная хронологическая летопись: порядок текста не обязательно совпадает с последовательностью событий в линейном времени. [Harvard ReVista] [Multepal]</w:t>
       </w:r>
     </w:p>
     <w:p>
       <w:r>
+        <w:rPr>
+          <w:rFonts w:ascii="Noto Serif" w:hAnsi="Noto Serif" w:eastAsia="Noto Serif"/>
+          <w:color w:val="252B42"/>
+          <w:sz w:val="21"/>
+        </w:rPr>
         <w:t>Среди фигур этой памяти — четыре первопредка, часто передаваемые как B’alam Ki’tze’, B’alam Aq’ab, Majukutaj и Iq’i B’alam. В этой книге мы называем их первопредками повествования, а не независимо датированными царями. Их функция — связать происхождение, путь и принадлежность к домам и линиям K’iche’. [Harvard ReVista] [Princeton Multepal]</w:t>
       </w:r>
     </w:p>
     <w:p>
       <w:r>
+        <w:rPr>
+          <w:rFonts w:ascii="Noto Serif" w:hAnsi="Noto Serif" w:eastAsia="Noto Serif"/>
+          <w:color w:val="252B42"/>
+          <w:sz w:val="21"/>
+        </w:rPr>
         <w:t>В рассказе появляется Tulán — место сакрально-исторического происхождения, связанное с властью и переходом предков к новым землям. Исследователи предлагали отождествлять его с конкретными местами, в том числе с Чичен-Ицей; такое отождествление остаётся гипотезой, а не установленной точкой на карте. Внутри повествования важнее то, что география хранит память об истоке и даёт язык, на котором можно говорить о праве и принадлежности. [LoC, обзор Florescano]</w:t>
       </w:r>
     </w:p>
     <w:p>
       <w:pPr>
-        <w:spacing w:after="100"/>
+        <w:spacing w:before="80" w:after="60"/>
+        <w:ind w:firstLine="0"/>
         <w:jc w:val="center"/>
+        <w:pBdr>
+          <w:top w:val="single" w:sz="7" w:space="5" w:color="B28B45"/>
+          <w:left w:val="single" w:sz="7" w:space="5" w:color="B28B45"/>
+          <w:bottom w:val="single" w:sz="7" w:space="5" w:color="B28B45"/>
+          <w:right w:val="single" w:sz="7" w:space="5" w:color="B28B45"/>
+        </w:pBdr>
       </w:pPr>
       <w:r>
         <w:drawing>
           <wp:inline xmlns:a="http://schemas.openxmlformats.org/drawingml/2006/main" xmlns:pic="http://schemas.openxmlformats.org/drawingml/2006/picture">
-            <wp:extent cx="3703320" cy="2468880"/>
-            <wp:docPr id="5" name="Picture 5"/>
+            <wp:extent cx="4914000" cy="3276000"/>
+            <wp:docPr id="5" name="Picture 5" descr="Авторская визуализация пути и памяти о земле; изображение не документирует миграцию или исторических людей" title="lineage"/>
             <wp:cNvGraphicFramePr>
               <a:graphicFrameLocks noChangeAspect="1"/>
             </wp:cNvGraphicFramePr>
@@ -878,7 +1603,7 @@
               <a:graphicData uri="http://schemas.openxmlformats.org/drawingml/2006/picture">
                 <pic:pic>
                   <pic:nvPicPr>
-                    <pic:cNvPr id="0" name="image.jpg"/>
+                    <pic:cNvPr id="0" name="lineage.jpg"/>
                     <pic:cNvPicPr/>
                   </pic:nvPicPr>
                   <pic:blipFill>
@@ -890,7 +1615,7 @@
                   <pic:spPr>
                     <a:xfrm>
                       <a:off x="0" y="0"/>
-                      <a:ext cx="3703320" cy="2468880"/>
+                      <a:ext cx="4914000" cy="3276000"/>
                     </a:xfrm>
                     <a:prstGeom prst="rect"/>
                   </pic:spPr>
@@ -903,266 +1628,503 @@
     </w:p>
     <w:p>
       <w:pPr>
+        <w:spacing w:before="0" w:after="140"/>
         <w:ind w:firstLine="0"/>
         <w:jc w:val="center"/>
       </w:pPr>
       <w:r>
         <w:rPr>
-          <w:rFonts w:ascii="Georgia" w:hAnsi="Georgia" w:eastAsia="Georgia"/>
+          <w:rFonts w:ascii="Noto Serif" w:hAnsi="Noto Serif" w:eastAsia="Noto Serif"/>
           <w:i/>
-          <w:color w:val="278F91"/>
-          <w:sz w:val="18"/>
+          <w:color w:val="247F87"/>
+          <w:sz w:val="17"/>
         </w:rPr>
         <w:t>Путь показан как современная художественная метафора, а не реконструкция конкретного исторического маршрута.</w:t>
       </w:r>
     </w:p>
     <w:p>
+      <w:pPr>
+        <w:spacing w:before="160" w:after="100"/>
+        <w:ind w:firstLine="0" w:left="170" w:right="113"/>
+        <w:shd w:fill="F0EDF3"/>
+        <w:pBdr>
+          <w:left w:val="single" w:sz="18" w:space="8" w:color="624B7D"/>
+        </w:pBdr>
+      </w:pPr>
       <w:r>
         <w:rPr>
+          <w:rFonts w:ascii="Noto Serif" w:hAnsi="Noto Serif" w:eastAsia="Noto Serif"/>
           <w:b/>
+          <w:color w:val="252B42"/>
+          <w:sz w:val="21"/>
         </w:rPr>
         <w:t>Источники к главе:</w:t>
       </w:r>
       <w:r>
+        <w:rPr>
+          <w:rFonts w:ascii="Noto Serif" w:hAnsi="Noto Serif" w:eastAsia="Noto Serif"/>
+          <w:color w:val="252B42"/>
+          <w:sz w:val="21"/>
+        </w:rPr>
         <w:t xml:space="preserve"> [Harvard ReVista] [Princeton Multepal Project] [Library of Congress, обзор Tulán].</w:t>
-      </w:r>
-    </w:p>
-    <w:p>
-      <w:r>
-        <w:br w:type="page"/>
       </w:r>
     </w:p>
     <w:p>
       <w:pPr>
         <w:pStyle w:val="Heading1"/>
+        <w:spacing w:before="100" w:after="220"/>
+        <w:ind w:firstLine="0"/>
+        <w:shd w:fill="E9EEF0"/>
+        <w:pBdr>
+          <w:left w:val="single" w:sz="18" w:space="8" w:color="B28B45"/>
+        </w:pBdr>
       </w:pPr>
       <w:r>
+        <w:rPr>
+          <w:rFonts w:ascii="Noto Sans" w:hAnsi="Noto Sans" w:eastAsia="Noto Sans"/>
+          <w:color w:val="B28B45"/>
+          <w:sz w:val="16"/>
+        </w:rPr>
+        <w:t>✦   ✧   ✦</w:t>
+        <w:br/>
+      </w:r>
+      <w:r>
+        <w:rPr>
+          <w:rFonts w:ascii="Noto Serif" w:hAnsi="Noto Serif" w:eastAsia="Noto Serif"/>
+          <w:color w:val="252B42"/>
+          <w:sz w:val="21"/>
+        </w:rPr>
         <w:t>11. Дома, память и право на землю</w:t>
       </w:r>
     </w:p>
     <w:p>
       <w:r>
+        <w:rPr>
+          <w:rFonts w:ascii="Noto Serif" w:hAnsi="Noto Serif" w:eastAsia="Noto Serif"/>
+          <w:color w:val="252B42"/>
+          <w:sz w:val="21"/>
+        </w:rPr>
         <w:t>Родословные поздней части — это не только перечень родственников. Повествование связывает происхождение с коллективными домами, должностями, авторитетом и правом говорить от имени общности. Оно даёт K’iche’ способ рассказывать о том, откуда пришли предки и почему определённые линии занимают своё место.</w:t>
       </w:r>
     </w:p>
     <w:p>
       <w:r>
+        <w:rPr>
+          <w:rFonts w:ascii="Noto Serif" w:hAnsi="Noto Serif" w:eastAsia="Noto Serif"/>
+          <w:color w:val="252B42"/>
+          <w:sz w:val="21"/>
+        </w:rPr>
         <w:t>Рядом с Popol Wuj существует Título de Totonicapán — колониальный земельный документ K’iche’, завершённый в 1554 году. Он тоже связывает предков, историю и права на землю, но не совпадает с Popol Wuj во всех деталях. Такие сходства и расхождения помогают увидеть, что разные тексты могли сохранять разные перспективы и одновременно действовать в мире колониальных правовых споров. [University Press of Colorado] [Quiroa]</w:t>
       </w:r>
     </w:p>
     <w:p>
       <w:r>
+        <w:rPr>
+          <w:rFonts w:ascii="Noto Serif" w:hAnsi="Noto Serif" w:eastAsia="Noto Serif"/>
+          <w:color w:val="252B42"/>
+          <w:sz w:val="21"/>
+        </w:rPr>
         <w:t>Это сопоставление требует осторожности. Título — не нейтральная летопись, свободная от политических интересов; исследователи описывают подобные документы как местные исторические рассказы и юридические аргументы, создававшиеся в условиях испанского суда. А гипотеза о том, что Popol Wuj отражал позицию одной из фракций K’iche’, принадлежит конкретному исследователю и не должна подаваться как установленное намерение всех создателей текста. [Quiroa] [van Akkeren]</w:t>
       </w:r>
     </w:p>
     <w:p>
       <w:r>
+        <w:rPr>
+          <w:rFonts w:ascii="Noto Serif" w:hAnsi="Noto Serif" w:eastAsia="Noto Serif"/>
+          <w:color w:val="252B42"/>
+          <w:sz w:val="21"/>
+        </w:rPr>
         <w:t>Здесь история предков не отделяется от земли. Сохранять память — значит не только рассказывать о прошлом, но и утверждать, кто имеет право жить на своей земле, говорить о ней и принимать решения. Это вывод о функции таких текстов и их колониальном контексте, а не доказательство каждой отдельной миграции или битвы.</w:t>
+      </w:r>
+    </w:p>
+    <w:p>
+      <w:pPr>
+        <w:spacing w:before="160" w:after="100"/>
+        <w:ind w:firstLine="0" w:left="170" w:right="113"/>
+        <w:shd w:fill="F0EDF3"/>
+        <w:pBdr>
+          <w:left w:val="single" w:sz="18" w:space="8" w:color="624B7D"/>
+        </w:pBdr>
+      </w:pPr>
+      <w:r>
+        <w:rPr>
+          <w:rFonts w:ascii="Noto Serif" w:hAnsi="Noto Serif" w:eastAsia="Noto Serif"/>
+          <w:b/>
+          <w:color w:val="252B42"/>
+          <w:sz w:val="21"/>
+        </w:rPr>
+        <w:t>Источники к главе:</w:t>
+      </w:r>
+      <w:r>
+        <w:rPr>
+          <w:rFonts w:ascii="Noto Serif" w:hAnsi="Noto Serif" w:eastAsia="Noto Serif"/>
+          <w:color w:val="252B42"/>
+          <w:sz w:val="21"/>
+        </w:rPr>
+        <w:t xml:space="preserve"> [University Press of Colorado, </w:t>
+      </w:r>
+      <w:r>
+        <w:rPr>
+          <w:rFonts w:ascii="Noto Serif" w:hAnsi="Noto Serif" w:eastAsia="Noto Serif"/>
+          <w:i/>
+          <w:color w:val="624B7D"/>
+          <w:sz w:val="21"/>
+        </w:rPr>
+        <w:t>The Title of Totonicapán</w:t>
+      </w:r>
+      <w:r>
+        <w:rPr>
+          <w:rFonts w:ascii="Noto Serif" w:hAnsi="Noto Serif" w:eastAsia="Noto Serif"/>
+          <w:color w:val="252B42"/>
+          <w:sz w:val="21"/>
+        </w:rPr>
+        <w:t>] [Quiroa] [van Akkeren, “Authors of the Popol Wuj”].</w:t>
+      </w:r>
+    </w:p>
+    <w:p>
+      <w:pPr>
+        <w:pStyle w:val="Heading1"/>
+        <w:spacing w:before="100" w:after="220"/>
+        <w:ind w:firstLine="0"/>
+        <w:shd w:fill="E9EEF0"/>
+        <w:pBdr>
+          <w:left w:val="single" w:sz="18" w:space="8" w:color="B28B45"/>
+        </w:pBdr>
+      </w:pPr>
+      <w:r>
+        <w:rPr>
+          <w:rFonts w:ascii="Noto Sans" w:hAnsi="Noto Sans" w:eastAsia="Noto Sans"/>
+          <w:color w:val="B28B45"/>
+          <w:sz w:val="16"/>
+        </w:rPr>
+        <w:t>✦   ✧   ✦</w:t>
+        <w:br/>
+      </w:r>
+      <w:r>
+        <w:rPr>
+          <w:rFonts w:ascii="Noto Serif" w:hAnsi="Noto Serif" w:eastAsia="Noto Serif"/>
+          <w:color w:val="252B42"/>
+          <w:sz w:val="21"/>
+        </w:rPr>
+        <w:t>12. Живой язык и открытое окончание</w:t>
       </w:r>
     </w:p>
     <w:p>
       <w:r>
         <w:rPr>
+          <w:rFonts w:ascii="Noto Serif" w:hAnsi="Noto Serif" w:eastAsia="Noto Serif"/>
+          <w:color w:val="252B42"/>
+          <w:sz w:val="21"/>
+        </w:rPr>
+        <w:t>Popol Wuj дошёл до нас не как немой предмет. K’iche’ — живой язык. Университет Нью-Мексико хранит архив из 149 аудиозаписанных и расшифрованных K’iche’ историй, собранных в западной Гватемале в 1960–1970-х годах; записи и транскрипции проверяли носители языка. Это самостоятельный документальный проект, а не доказательство того, что любая современная история буквально повторяет рукопись начала XVIII века. [UNM]</w:t>
+      </w:r>
+    </w:p>
+    <w:p>
+      <w:r>
+        <w:rPr>
+          <w:rFonts w:ascii="Noto Serif" w:hAnsi="Noto Serif" w:eastAsia="Noto Serif"/>
+          <w:color w:val="252B42"/>
+          <w:sz w:val="21"/>
+        </w:rPr>
+        <w:t>Академия языков Maya Гватемалы приводит для K’iche’ 1 680 551 говорящего по переписи 2018 года. Такое число следует указывать только вместе с источником и годом. Оно напоминает о масштабе живого языка, но за ним стоят люди и разные сообщества, а не единый голос. [ALMG]</w:t>
+      </w:r>
+    </w:p>
+    <w:p>
+      <w:r>
+        <w:rPr>
+          <w:rFonts w:ascii="Noto Serif" w:hAnsi="Noto Serif" w:eastAsia="Noto Serif"/>
+          <w:color w:val="252B42"/>
+          <w:sz w:val="21"/>
+        </w:rPr>
+        <w:t>Совместный проект Multepal подчёркивает уважение к Indigenous data sovereignty и сотрудничество с K’iche’ участниками при создании цифровых материалов. Это позиция конкретного проекта, не универсальное заявление обо всех сообществах. Но она предлагает важную редакторскую дисциплину: спрашивать, кто говорит, кто хранит знание и на чьих условиях его показывают. [Multepal]</w:t>
+      </w:r>
+    </w:p>
+    <w:p>
+      <w:r>
+        <w:rPr>
+          <w:rFonts w:ascii="Noto Serif" w:hAnsi="Noto Serif" w:eastAsia="Noto Serif"/>
+          <w:color w:val="252B42"/>
+          <w:sz w:val="21"/>
+        </w:rPr>
+        <w:t>Эта книга заканчивается не разгадкой «мира Maya», а признанием границ собственного пересказа. Мы читали текст, прошедший через устную передачу, колониальную запись, перевод и архив. Перед нами — не единственный неизменный оригинал и не замена современным K’iche’ голосам. Рассказ остаётся открытым, потому что его память живёт не только на странице.</w:t>
+      </w:r>
+    </w:p>
+    <w:p>
+      <w:pPr>
+        <w:spacing w:before="160" w:after="100"/>
+        <w:ind w:firstLine="0" w:left="170" w:right="113"/>
+        <w:shd w:fill="F0EDF3"/>
+        <w:pBdr>
+          <w:left w:val="single" w:sz="18" w:space="8" w:color="624B7D"/>
+        </w:pBdr>
+      </w:pPr>
+      <w:r>
+        <w:rPr>
+          <w:rFonts w:ascii="Noto Serif" w:hAnsi="Noto Serif" w:eastAsia="Noto Serif"/>
           <w:b/>
+          <w:color w:val="252B42"/>
+          <w:sz w:val="21"/>
         </w:rPr>
         <w:t>Источники к главе:</w:t>
       </w:r>
       <w:r>
-        <w:t xml:space="preserve"> [University Press of Colorado, </w:t>
-      </w:r>
-      <w:r>
         <w:rPr>
-          <w:i/>
+          <w:rFonts w:ascii="Noto Serif" w:hAnsi="Noto Serif" w:eastAsia="Noto Serif"/>
+          <w:color w:val="252B42"/>
+          <w:sz w:val="21"/>
         </w:rPr>
-        <w:t>The Title of Totonicapán</w:t>
-      </w:r>
-      <w:r>
-        <w:t>] [Quiroa] [van Akkeren, “Authors of the Popol Wuj”].</w:t>
-      </w:r>
-    </w:p>
-    <w:p>
-      <w:r>
-        <w:br w:type="page"/>
+        <w:t xml:space="preserve"> [UNM K’iche’ Maya Oral History Project] [ALMG] [Multepal].</w:t>
       </w:r>
     </w:p>
     <w:p>
       <w:pPr>
         <w:pStyle w:val="Heading1"/>
+        <w:spacing w:before="100" w:after="220"/>
+        <w:ind w:firstLine="0"/>
+        <w:shd w:fill="E9EEF0"/>
+        <w:pBdr>
+          <w:left w:val="single" w:sz="18" w:space="8" w:color="B28B45"/>
+        </w:pBdr>
       </w:pPr>
       <w:r>
-        <w:t>12. Живой язык и открытое окончание</w:t>
+        <w:rPr>
+          <w:rFonts w:ascii="Noto Sans" w:hAnsi="Noto Sans" w:eastAsia="Noto Sans"/>
+          <w:color w:val="B28B45"/>
+          <w:sz w:val="16"/>
+        </w:rPr>
+        <w:t>✦   ✧   ✦</w:t>
+        <w:br/>
       </w:r>
-    </w:p>
-    <w:p>
-      <w:r>
-        <w:t>Popol Wuj дошёл до нас не как немой предмет. K’iche’ — живой язык. Университет Нью-Мексико хранит архив из 149 аудиозаписанных и расшифрованных K’iche’ историй, собранных в западной Гватемале в 1960–1970-х годах; записи и транскрипции проверяли носители языка. Это самостоятельный документальный проект, а не доказательство того, что любая современная история буквально повторяет рукопись начала XVIII века. [UNM]</w:t>
-      </w:r>
-    </w:p>
-    <w:p>
-      <w:r>
-        <w:t>Академия языков Maya Гватемалы приводит для K’iche’ 1 680 551 говорящего по переписи 2018 года. Такое число следует указывать только вместе с источником и годом. Оно напоминает о масштабе живого языка, но за ним стоят люди и разные сообщества, а не единый голос. [ALMG]</w:t>
-      </w:r>
-    </w:p>
-    <w:p>
-      <w:r>
-        <w:t>Совместный проект Multepal подчёркивает уважение к Indigenous data sovereignty и сотрудничество с K’iche’ участниками при создании цифровых материалов. Это позиция конкретного проекта, не универсальное заявление обо всех сообществах. Но она предлагает важную редакторскую дисциплину: спрашивать, кто говорит, кто хранит знание и на чьих условиях его показывают. [Multepal]</w:t>
-      </w:r>
-    </w:p>
-    <w:p>
-      <w:r>
-        <w:t>Эта книга заканчивается не разгадкой «мира Maya», а признанием границ собственного пересказа. Мы читали текст, прошедший через устную передачу, колониальную запись, перевод и архив. Перед нами — не единственный неизменный оригинал и не замена современным K’iche’ голосам. Рассказ остаётся открытым, потому что его память живёт не только на странице.</w:t>
-      </w:r>
-    </w:p>
-    <w:p>
       <w:r>
         <w:rPr>
-          <w:b/>
+          <w:rFonts w:ascii="Noto Serif" w:hAnsi="Noto Serif" w:eastAsia="Noto Serif"/>
+          <w:color w:val="252B42"/>
+          <w:sz w:val="21"/>
         </w:rPr>
-        <w:t>Источники к главе:</w:t>
-      </w:r>
-      <w:r>
-        <w:t xml:space="preserve"> [UNM K’iche’ Maya Oral History Project] [ALMG] [Multepal].</w:t>
-      </w:r>
-    </w:p>
-    <w:p>
-      <w:r>
-        <w:br w:type="page"/>
-      </w:r>
-    </w:p>
-    <w:p>
-      <w:pPr>
-        <w:pStyle w:val="Heading1"/>
-      </w:pPr>
-      <w:r>
         <w:t>13. Краткое исследовательское приложение</w:t>
       </w:r>
     </w:p>
     <w:p>
       <w:pPr>
         <w:pStyle w:val="Heading2"/>
+        <w:ind w:firstLine="0"/>
       </w:pPr>
       <w:r>
+        <w:rPr>
+          <w:rFonts w:ascii="Noto Serif" w:hAnsi="Noto Serif" w:eastAsia="Noto Serif"/>
+          <w:color w:val="252B42"/>
+          <w:sz w:val="21"/>
+        </w:rPr>
         <w:t>Что именно здесь называется рукописью</w:t>
       </w:r>
     </w:p>
     <w:p>
       <w:r>
+        <w:rPr>
+          <w:rFonts w:ascii="Noto Serif" w:hAnsi="Noto Serif" w:eastAsia="Noto Serif"/>
+          <w:color w:val="252B42"/>
+          <w:sz w:val="21"/>
+        </w:rPr>
         <w:t>Ayer MS 1515 — сохранившийся колониальный рукописный комплекс Newberry Library, связанный с Франсиско Хименесом. В нём находится K’iche’ текст латинским письмом и испанская версия. Library of Congress описывает Popol Vuh-часть как 1700–1703 годы; Newberry даёт более широкий диапазон 1700–1715 для транскрипции и связанного корпуса. Упоминание предполагаемой записи 1554–1558 годов относится к научной реконструкции более ранней формы. Самостоятельный рукописный экземпляр этой ранней записи не сохранился. [Newberry] [LoC] [Multepal]</w:t>
       </w:r>
     </w:p>
     <w:p>
       <w:r>
+        <w:rPr>
+          <w:rFonts w:ascii="Noto Serif" w:hAnsi="Noto Serif" w:eastAsia="Noto Serif"/>
+          <w:color w:val="252B42"/>
+          <w:sz w:val="21"/>
+        </w:rPr>
         <w:t>Поэтому в этой книге различаются три уровня: материальный свидетель, который можно исследовать в архиве; предполагаемые ранние письменные и устные формы; гипотетическая более ранняя композиция. Слово «оригинал» без объяснения смешало бы эти уровни и создало бы неверное впечатление.</w:t>
       </w:r>
     </w:p>
     <w:p>
       <w:pPr>
         <w:pStyle w:val="Heading2"/>
+        <w:ind w:firstLine="0"/>
       </w:pPr>
       <w:r>
+        <w:rPr>
+          <w:rFonts w:ascii="Noto Serif" w:hAnsi="Noto Serif" w:eastAsia="Noto Serif"/>
+          <w:color w:val="252B42"/>
+          <w:sz w:val="21"/>
+        </w:rPr>
         <w:t>Короткая заметка о переводе и именах</w:t>
       </w:r>
     </w:p>
     <w:p>
       <w:r>
+        <w:rPr>
+          <w:rFonts w:ascii="Noto Serif" w:hAnsi="Noto Serif" w:eastAsia="Noto Serif"/>
+          <w:color w:val="252B42"/>
+          <w:sz w:val="21"/>
+        </w:rPr>
         <w:t>Русский текст — авторский пересказ по институциональным описаниям, исследовательским публикациям и сюжетным обзорам. Он не следует близко ни одному современному переводу. Повествование сжато и разделено на главы заново. Имена и термины приведены к одной удобной для чтения системе, но иные написания могут отражать другие издания, диалекты или редакторские решения. Для научного или коммерческого издания потребуется дополнительная сверка K’iche’ написаний с квалифицированным специалистом и консультация с современными K’iche’ участниками.</w:t>
       </w:r>
     </w:p>
     <w:p>
       <w:pPr>
         <w:pStyle w:val="Heading2"/>
+        <w:ind w:firstLine="0"/>
       </w:pPr>
       <w:r>
+        <w:rPr>
+          <w:rFonts w:ascii="Noto Serif" w:hAnsi="Noto Serif" w:eastAsia="Noto Serif"/>
+          <w:color w:val="252B42"/>
+          <w:sz w:val="21"/>
+        </w:rPr>
         <w:t>Источники по главам</w:t>
       </w:r>
     </w:p>
     <w:p>
       <w:pPr>
         <w:pStyle w:val="ListBullet"/>
-        <w:ind w:firstLine="0" w:left="340"/>
+        <w:spacing w:after="20" w:line="259" w:lineRule="auto"/>
+        <w:ind w:left="397" w:firstLine="0"/>
       </w:pPr>
       <w:r>
         <w:rPr>
+          <w:rFonts w:ascii="Noto Serif" w:hAnsi="Noto Serif" w:eastAsia="Noto Serif"/>
           <w:b/>
+          <w:color w:val="252B42"/>
+          <w:sz w:val="18"/>
         </w:rPr>
         <w:t>Примечание, рукопись и передача:</w:t>
       </w:r>
       <w:r>
+        <w:rPr>
+          <w:rFonts w:ascii="Noto Serif" w:hAnsi="Noto Serif" w:eastAsia="Noto Serif"/>
+          <w:color w:val="252B42"/>
+          <w:sz w:val="18"/>
+        </w:rPr>
         <w:t xml:space="preserve"> [Newberry Library] [Library of Congress] [Harvard ReVista] [Multepal].</w:t>
       </w:r>
     </w:p>
     <w:p>
       <w:pPr>
         <w:pStyle w:val="ListBullet"/>
-        <w:ind w:firstLine="0" w:left="340"/>
+        <w:spacing w:after="20" w:line="259" w:lineRule="auto"/>
+        <w:ind w:left="397" w:firstLine="0"/>
       </w:pPr>
       <w:r>
         <w:rPr>
+          <w:rFonts w:ascii="Noto Serif" w:hAnsi="Noto Serif" w:eastAsia="Noto Serif"/>
           <w:b/>
+          <w:color w:val="252B42"/>
+          <w:sz w:val="18"/>
         </w:rPr>
         <w:t>Главы 1–3, создание мира и кукурузные люди:</w:t>
       </w:r>
       <w:r>
+        <w:rPr>
+          <w:rFonts w:ascii="Noto Serif" w:hAnsi="Noto Serif" w:eastAsia="Noto Serif"/>
+          <w:color w:val="252B42"/>
+          <w:sz w:val="18"/>
+        </w:rPr>
         <w:t xml:space="preserve"> [American Historical Association] [Smithsonian National Museum of the American Indian] [Smarthistory / Denver Art Museum] [Purdue, текстовая версия Book 4].</w:t>
       </w:r>
     </w:p>
     <w:p>
       <w:pPr>
         <w:pStyle w:val="ListBullet"/>
-        <w:ind w:firstLine="0" w:left="340"/>
+        <w:spacing w:after="20" w:line="259" w:lineRule="auto"/>
+        <w:ind w:left="397" w:firstLine="0"/>
       </w:pPr>
       <w:r>
         <w:rPr>
+          <w:rFonts w:ascii="Noto Serif" w:hAnsi="Noto Serif" w:eastAsia="Noto Serif"/>
           <w:b/>
+          <w:color w:val="252B42"/>
+          <w:sz w:val="18"/>
         </w:rPr>
         <w:t>Главы 4–9, близнецы и Шибальба:</w:t>
       </w:r>
       <w:r>
+        <w:rPr>
+          <w:rFonts w:ascii="Noto Serif" w:hAnsi="Noto Serif" w:eastAsia="Noto Serif"/>
+          <w:color w:val="252B42"/>
+          <w:sz w:val="18"/>
+        </w:rPr>
         <w:t xml:space="preserve"> [Mesoweb, “The Hero Twins”] [American Historical Association] [Smithsonian National Museum of the American Indian].</w:t>
       </w:r>
     </w:p>
     <w:p>
       <w:pPr>
         <w:pStyle w:val="ListBullet"/>
-        <w:ind w:firstLine="0" w:left="340"/>
+        <w:spacing w:after="20" w:line="259" w:lineRule="auto"/>
+        <w:ind w:left="397" w:firstLine="0"/>
       </w:pPr>
       <w:r>
         <w:rPr>
+          <w:rFonts w:ascii="Noto Serif" w:hAnsi="Noto Serif" w:eastAsia="Noto Serif"/>
           <w:b/>
+          <w:color w:val="252B42"/>
+          <w:sz w:val="18"/>
         </w:rPr>
         <w:t>Главы 10–11, предки, земля и поздняя историческая часть:</w:t>
       </w:r>
       <w:r>
+        <w:rPr>
+          <w:rFonts w:ascii="Noto Serif" w:hAnsi="Noto Serif" w:eastAsia="Noto Serif"/>
+          <w:color w:val="252B42"/>
+          <w:sz w:val="18"/>
+        </w:rPr>
         <w:t xml:space="preserve"> [Harvard ReVista] [Princeton Multepal Project] [Library of Congress, обзор Florescano] [University Press of Colorado] [Quiroa] [van Akkeren].</w:t>
       </w:r>
     </w:p>
     <w:p>
       <w:pPr>
         <w:pStyle w:val="ListBullet"/>
-        <w:ind w:firstLine="0" w:left="340"/>
+        <w:spacing w:after="20" w:line="259" w:lineRule="auto"/>
+        <w:ind w:left="397" w:firstLine="0"/>
       </w:pPr>
       <w:r>
         <w:rPr>
+          <w:rFonts w:ascii="Noto Serif" w:hAnsi="Noto Serif" w:eastAsia="Noto Serif"/>
           <w:b/>
+          <w:color w:val="252B42"/>
+          <w:sz w:val="18"/>
         </w:rPr>
         <w:t>Глава 12, живой язык и совместная работа:</w:t>
       </w:r>
       <w:r>
+        <w:rPr>
+          <w:rFonts w:ascii="Noto Serif" w:hAnsi="Noto Serif" w:eastAsia="Noto Serif"/>
+          <w:color w:val="252B42"/>
+          <w:sz w:val="18"/>
+        </w:rPr>
         <w:t xml:space="preserve"> [UNM K’iche’ Maya Oral History Project] [ALMG] [Multepal].</w:t>
       </w:r>
     </w:p>
     <w:p>
       <w:pPr>
         <w:pStyle w:val="Heading2"/>
+        <w:ind w:firstLine="0"/>
       </w:pPr>
       <w:r>
+        <w:rPr>
+          <w:rFonts w:ascii="Noto Serif" w:hAnsi="Noto Serif" w:eastAsia="Noto Serif"/>
+          <w:color w:val="252B42"/>
+          <w:sz w:val="21"/>
+        </w:rPr>
         <w:t>Краткий список источников</w:t>
       </w:r>
     </w:p>
     <w:p>
+      <w:pPr>
+        <w:spacing w:before="40" w:after="40" w:line="252" w:lineRule="auto"/>
+        <w:ind w:firstLine="0"/>
+        <w:shd w:fill="E9EEF0"/>
+        <w:pBdr>
+          <w:left w:val="single" w:sz="18" w:space="8" w:color="B28B45"/>
+        </w:pBdr>
+      </w:pPr>
       <w:r>
         <w:rPr>
+          <w:rFonts w:ascii="Noto Serif" w:hAnsi="Noto Serif" w:eastAsia="Noto Serif"/>
           <w:b/>
+          <w:color w:val="252B42"/>
+          <w:sz w:val="18"/>
         </w:rPr>
         <w:t>Рукопись и история передачи</w:t>
       </w:r>
@@ -1170,79 +2132,122 @@
     <w:p>
       <w:pPr>
         <w:pStyle w:val="ListBullet"/>
-        <w:ind w:firstLine="0" w:left="340"/>
+        <w:spacing w:after="20" w:line="259" w:lineRule="auto"/>
+        <w:ind w:left="397" w:firstLine="0"/>
       </w:pPr>
       <w:hyperlink r:id="rId16">
         <w:r>
           <w:rPr>
-            <w:color w:val="278F91"/>
+            <w:color w:val="247F87"/>
             <w:u w:val="single"/>
+            <w:rFonts w:ascii="Noto Serif" w:eastAsia="Noto Serif"/>
+            <w:sz w:val="18"/>
           </w:rPr>
           <w:t>Newberry Library, “Popol Vuh”</w:t>
         </w:r>
       </w:hyperlink>
       <w:r>
+        <w:rPr>
+          <w:rFonts w:ascii="Noto Serif" w:hAnsi="Noto Serif" w:eastAsia="Noto Serif"/>
+          <w:color w:val="252B42"/>
+          <w:sz w:val="18"/>
+        </w:rPr>
         <w:t xml:space="preserve"> — Ayer MS 1515, Хименес, признаки текста и история хранения.</w:t>
       </w:r>
     </w:p>
     <w:p>
       <w:pPr>
         <w:pStyle w:val="ListBullet"/>
-        <w:ind w:firstLine="0" w:left="340"/>
+        <w:spacing w:after="20" w:line="259" w:lineRule="auto"/>
+        <w:ind w:left="397" w:firstLine="0"/>
       </w:pPr>
       <w:hyperlink r:id="rId17">
         <w:r>
           <w:rPr>
-            <w:color w:val="278F91"/>
+            <w:color w:val="247F87"/>
             <w:u w:val="single"/>
+            <w:rFonts w:ascii="Noto Serif" w:eastAsia="Noto Serif"/>
+            <w:sz w:val="18"/>
           </w:rPr>
           <w:t>Library of Congress, “Popol Vuh: Transcription in Quiché Mayan and Translation into Spanish”</w:t>
         </w:r>
       </w:hyperlink>
       <w:r>
+        <w:rPr>
+          <w:rFonts w:ascii="Noto Serif" w:hAnsi="Noto Serif" w:eastAsia="Noto Serif"/>
+          <w:color w:val="252B42"/>
+          <w:sz w:val="18"/>
+        </w:rPr>
         <w:t xml:space="preserve"> — описание экземпляра и каталожная дата.</w:t>
       </w:r>
     </w:p>
     <w:p>
       <w:pPr>
         <w:pStyle w:val="ListBullet"/>
-        <w:ind w:firstLine="0" w:left="340"/>
+        <w:spacing w:after="20" w:line="259" w:lineRule="auto"/>
+        <w:ind w:left="397" w:firstLine="0"/>
       </w:pPr>
       <w:hyperlink r:id="rId18">
         <w:r>
           <w:rPr>
-            <w:color w:val="278F91"/>
+            <w:color w:val="247F87"/>
             <w:u w:val="single"/>
+            <w:rFonts w:ascii="Noto Serif" w:eastAsia="Noto Serif"/>
+            <w:sz w:val="18"/>
           </w:rPr>
           <w:t>Harvard ReVista, “Translating the Maya Popol Wuj”</w:t>
         </w:r>
       </w:hyperlink>
       <w:r>
+        <w:rPr>
+          <w:rFonts w:ascii="Noto Serif" w:hAnsi="Noto Serif" w:eastAsia="Noto Serif"/>
+          <w:color w:val="252B42"/>
+          <w:sz w:val="18"/>
+        </w:rPr>
         <w:t xml:space="preserve"> — история публикаций и атрибутированные реконструкции.</w:t>
       </w:r>
     </w:p>
     <w:p>
       <w:pPr>
         <w:pStyle w:val="ListBullet"/>
-        <w:ind w:firstLine="0" w:left="340"/>
+        <w:spacing w:after="20" w:line="259" w:lineRule="auto"/>
+        <w:ind w:left="397" w:firstLine="0"/>
       </w:pPr>
       <w:hyperlink r:id="rId19">
         <w:r>
           <w:rPr>
-            <w:color w:val="278F91"/>
+            <w:color w:val="247F87"/>
             <w:u w:val="single"/>
+            <w:rFonts w:ascii="Noto Serif" w:eastAsia="Noto Serif"/>
+            <w:sz w:val="18"/>
           </w:rPr>
           <w:t>Multepal Project, University of Virginia</w:t>
         </w:r>
       </w:hyperlink>
       <w:r>
+        <w:rPr>
+          <w:rFonts w:ascii="Noto Serif" w:hAnsi="Noto Serif" w:eastAsia="Noto Serif"/>
+          <w:color w:val="252B42"/>
+          <w:sz w:val="18"/>
+        </w:rPr>
         <w:t xml:space="preserve"> — совместная цифровая работа и история передачи.</w:t>
       </w:r>
     </w:p>
     <w:p>
+      <w:pPr>
+        <w:spacing w:before="40" w:after="40" w:line="252" w:lineRule="auto"/>
+        <w:ind w:firstLine="0"/>
+        <w:shd w:fill="E9EEF0"/>
+        <w:pBdr>
+          <w:left w:val="single" w:sz="18" w:space="8" w:color="B28B45"/>
+        </w:pBdr>
+      </w:pPr>
       <w:r>
         <w:rPr>
+          <w:rFonts w:ascii="Noto Serif" w:hAnsi="Noto Serif" w:eastAsia="Noto Serif"/>
           <w:b/>
+          <w:color w:val="252B42"/>
+          <w:sz w:val="18"/>
         </w:rPr>
         <w:t>Сюжетные ориентиры</w:t>
       </w:r>
@@ -1250,97 +2255,148 @@
     <w:p>
       <w:pPr>
         <w:pStyle w:val="ListBullet"/>
-        <w:ind w:firstLine="0" w:left="340"/>
+        <w:spacing w:after="20" w:line="259" w:lineRule="auto"/>
+        <w:ind w:left="397" w:firstLine="0"/>
       </w:pPr>
       <w:hyperlink r:id="rId20">
         <w:r>
           <w:rPr>
-            <w:color w:val="278F91"/>
+            <w:color w:val="247F87"/>
             <w:u w:val="single"/>
+            <w:rFonts w:ascii="Noto Serif" w:eastAsia="Noto Serif"/>
+            <w:sz w:val="18"/>
           </w:rPr>
           <w:t>American Historical Association, “Popol Vuh”</w:t>
         </w:r>
       </w:hyperlink>
       <w:r>
+        <w:rPr>
+          <w:rFonts w:ascii="Noto Serif" w:hAnsi="Noto Serif" w:eastAsia="Noto Serif"/>
+          <w:color w:val="252B42"/>
+          <w:sz w:val="18"/>
+        </w:rPr>
         <w:t xml:space="preserve"> — образовательный обзор текста и его истории.</w:t>
       </w:r>
     </w:p>
     <w:p>
       <w:pPr>
         <w:pStyle w:val="ListBullet"/>
-        <w:ind w:firstLine="0" w:left="340"/>
+        <w:spacing w:after="20" w:line="259" w:lineRule="auto"/>
+        <w:ind w:left="397" w:firstLine="0"/>
       </w:pPr>
       <w:hyperlink r:id="rId21">
         <w:r>
           <w:rPr>
-            <w:color w:val="278F91"/>
+            <w:color w:val="247F87"/>
             <w:u w:val="single"/>
+            <w:rFonts w:ascii="Noto Serif" w:eastAsia="Noto Serif"/>
+            <w:sz w:val="18"/>
           </w:rPr>
           <w:t>Smithsonian NMAI, “Creation Story of the Maya”</w:t>
         </w:r>
       </w:hyperlink>
       <w:r>
+        <w:rPr>
+          <w:rFonts w:ascii="Noto Serif" w:hAnsi="Noto Serif" w:eastAsia="Noto Serif"/>
+          <w:color w:val="252B42"/>
+          <w:sz w:val="18"/>
+        </w:rPr>
         <w:t xml:space="preserve"> — музейное изложение и отдельный современный K’iche’ голос.</w:t>
       </w:r>
     </w:p>
     <w:p>
       <w:pPr>
         <w:pStyle w:val="ListBullet"/>
-        <w:ind w:firstLine="0" w:left="340"/>
+        <w:spacing w:after="20" w:line="259" w:lineRule="auto"/>
+        <w:ind w:left="397" w:firstLine="0"/>
       </w:pPr>
       <w:hyperlink r:id="rId22">
         <w:r>
           <w:rPr>
-            <w:color w:val="278F91"/>
+            <w:color w:val="247F87"/>
             <w:u w:val="single"/>
+            <w:rFonts w:ascii="Noto Serif" w:eastAsia="Noto Serif"/>
+            <w:sz w:val="18"/>
           </w:rPr>
           <w:t>Smarthistory / Denver Art Museum, “An excerpt from an origin story”</w:t>
         </w:r>
       </w:hyperlink>
       <w:r>
+        <w:rPr>
+          <w:rFonts w:ascii="Noto Serif" w:hAnsi="Noto Serif" w:eastAsia="Noto Serif"/>
+          <w:color w:val="252B42"/>
+          <w:sz w:val="18"/>
+        </w:rPr>
         <w:t xml:space="preserve"> — образовательный материал о начальной части.</w:t>
       </w:r>
     </w:p>
     <w:p>
       <w:pPr>
         <w:pStyle w:val="ListBullet"/>
-        <w:ind w:firstLine="0" w:left="340"/>
+        <w:spacing w:after="20" w:line="259" w:lineRule="auto"/>
+        <w:ind w:left="397" w:firstLine="0"/>
       </w:pPr>
       <w:hyperlink r:id="rId23">
         <w:r>
           <w:rPr>
-            <w:color w:val="278F91"/>
+            <w:color w:val="247F87"/>
             <w:u w:val="single"/>
+            <w:rFonts w:ascii="Noto Serif" w:eastAsia="Noto Serif"/>
+            <w:sz w:val="18"/>
           </w:rPr>
           <w:t>Mesoweb, “The Hero Twins”</w:t>
         </w:r>
       </w:hyperlink>
       <w:r>
+        <w:rPr>
+          <w:rFonts w:ascii="Noto Serif" w:hAnsi="Noto Serif" w:eastAsia="Noto Serif"/>
+          <w:color w:val="252B42"/>
+          <w:sz w:val="18"/>
+        </w:rPr>
         <w:t xml:space="preserve"> — подробный сюжетный каркас цикла близнецов; использован только для проверки последовательности, не как источник формулировок.</w:t>
       </w:r>
     </w:p>
     <w:p>
       <w:pPr>
         <w:pStyle w:val="ListBullet"/>
-        <w:ind w:firstLine="0" w:left="340"/>
+        <w:spacing w:after="20" w:line="259" w:lineRule="auto"/>
+        <w:ind w:left="397" w:firstLine="0"/>
       </w:pPr>
       <w:hyperlink r:id="rId24">
         <w:r>
           <w:rPr>
-            <w:color w:val="278F91"/>
+            <w:color w:val="247F87"/>
             <w:u w:val="single"/>
+            <w:rFonts w:ascii="Noto Serif" w:eastAsia="Noto Serif"/>
+            <w:sz w:val="18"/>
           </w:rPr>
           <w:t>Purdue, Popol Vuh Book 4</w:t>
         </w:r>
       </w:hyperlink>
       <w:r>
+        <w:rPr>
+          <w:rFonts w:ascii="Noto Serif" w:hAnsi="Noto Serif" w:eastAsia="Noto Serif"/>
+          <w:color w:val="252B42"/>
+          <w:sz w:val="18"/>
+        </w:rPr>
         <w:t xml:space="preserve"> — переводная текстовая версия для проверки мотива кукурузы; это не оригинал K’iche’.</w:t>
       </w:r>
     </w:p>
     <w:p>
+      <w:pPr>
+        <w:spacing w:before="40" w:after="40" w:line="252" w:lineRule="auto"/>
+        <w:ind w:firstLine="0"/>
+        <w:shd w:fill="E9EEF0"/>
+        <w:pBdr>
+          <w:left w:val="single" w:sz="18" w:space="8" w:color="B28B45"/>
+        </w:pBdr>
+      </w:pPr>
       <w:r>
         <w:rPr>
+          <w:rFonts w:ascii="Noto Serif" w:hAnsi="Noto Serif" w:eastAsia="Noto Serif"/>
           <w:b/>
+          <w:color w:val="252B42"/>
+          <w:sz w:val="18"/>
         </w:rPr>
         <w:t>Поздняя историческая часть и живой язык</w:t>
       </w:r>
@@ -1348,100 +2404,147 @@
     <w:p>
       <w:pPr>
         <w:pStyle w:val="ListBullet"/>
-        <w:ind w:firstLine="0" w:left="340"/>
+        <w:spacing w:after="20" w:line="259" w:lineRule="auto"/>
+        <w:ind w:left="397" w:firstLine="0"/>
       </w:pPr>
       <w:hyperlink r:id="rId25">
         <w:r>
           <w:rPr>
-            <w:color w:val="278F91"/>
+            <w:color w:val="247F87"/>
             <w:u w:val="single"/>
+            <w:rFonts w:ascii="Noto Serif" w:eastAsia="Noto Serif"/>
+            <w:sz w:val="18"/>
           </w:rPr>
           <w:t>University Press of Colorado, The Title of Totonicapán</w:t>
         </w:r>
       </w:hyperlink>
       <w:r>
+        <w:rPr>
+          <w:rFonts w:ascii="Noto Serif" w:hAnsi="Noto Serif" w:eastAsia="Noto Serif"/>
+          <w:color w:val="252B42"/>
+          <w:sz w:val="18"/>
+        </w:rPr>
         <w:t xml:space="preserve"> — контекст земельного документа 1554 года.</w:t>
       </w:r>
     </w:p>
     <w:p>
       <w:pPr>
         <w:pStyle w:val="ListBullet"/>
-        <w:ind w:firstLine="0" w:left="340"/>
+        <w:spacing w:after="20" w:line="259" w:lineRule="auto"/>
+        <w:ind w:left="397" w:firstLine="0"/>
       </w:pPr>
       <w:hyperlink r:id="rId26">
         <w:r>
           <w:rPr>
-            <w:color w:val="278F91"/>
+            <w:color w:val="247F87"/>
             <w:u w:val="single"/>
+            <w:rFonts w:ascii="Noto Serif" w:eastAsia="Noto Serif"/>
+            <w:sz w:val="18"/>
           </w:rPr>
           <w:t>Néstor I. Quiroa, “Revisiting the Highland Guatemala Títulos”</w:t>
         </w:r>
       </w:hyperlink>
       <w:r>
+        <w:rPr>
+          <w:rFonts w:ascii="Noto Serif" w:hAnsi="Noto Serif" w:eastAsia="Noto Serif"/>
+          <w:color w:val="252B42"/>
+          <w:sz w:val="18"/>
+        </w:rPr>
         <w:t xml:space="preserve"> — колониальная юридическая функция títulos.</w:t>
       </w:r>
     </w:p>
     <w:p>
       <w:pPr>
         <w:pStyle w:val="ListBullet"/>
-        <w:ind w:firstLine="0" w:left="340"/>
+        <w:spacing w:after="20" w:line="259" w:lineRule="auto"/>
+        <w:ind w:left="397" w:firstLine="0"/>
       </w:pPr>
       <w:hyperlink r:id="rId27">
         <w:r>
           <w:rPr>
-            <w:color w:val="278F91"/>
+            <w:color w:val="247F87"/>
             <w:u w:val="single"/>
+            <w:rFonts w:ascii="Noto Serif" w:eastAsia="Noto Serif"/>
+            <w:sz w:val="18"/>
           </w:rPr>
           <w:t>R. W. van Akkeren, “Authors of the Popol Wuj”</w:t>
         </w:r>
       </w:hyperlink>
       <w:r>
+        <w:rPr>
+          <w:rFonts w:ascii="Noto Serif" w:hAnsi="Noto Serif" w:eastAsia="Noto Serif"/>
+          <w:color w:val="252B42"/>
+          <w:sz w:val="18"/>
+        </w:rPr>
         <w:t xml:space="preserve"> — атрибутированная гипотеза об авторах и политическом контексте.</w:t>
       </w:r>
     </w:p>
     <w:p>
       <w:pPr>
         <w:pStyle w:val="ListBullet"/>
-        <w:ind w:firstLine="0" w:left="340"/>
+        <w:spacing w:after="20" w:line="259" w:lineRule="auto"/>
+        <w:ind w:left="397" w:firstLine="0"/>
       </w:pPr>
       <w:hyperlink r:id="rId28">
         <w:r>
           <w:rPr>
-            <w:color w:val="278F91"/>
+            <w:color w:val="247F87"/>
             <w:u w:val="single"/>
+            <w:rFonts w:ascii="Noto Serif" w:eastAsia="Noto Serif"/>
+            <w:sz w:val="18"/>
           </w:rPr>
           <w:t>University of New Mexico, K’iche’ Maya Oral History Project</w:t>
         </w:r>
       </w:hyperlink>
       <w:r>
+        <w:rPr>
+          <w:rFonts w:ascii="Noto Serif" w:hAnsi="Noto Serif" w:eastAsia="Noto Serif"/>
+          <w:color w:val="252B42"/>
+          <w:sz w:val="18"/>
+        </w:rPr>
         <w:t xml:space="preserve"> — аудиозаписи и транскрипции современных устных историй.</w:t>
       </w:r>
     </w:p>
     <w:p>
       <w:pPr>
         <w:pStyle w:val="ListBullet"/>
-        <w:ind w:firstLine="0" w:left="340"/>
+        <w:spacing w:after="20" w:line="259" w:lineRule="auto"/>
+        <w:ind w:left="397" w:firstLine="0"/>
       </w:pPr>
       <w:hyperlink r:id="rId29">
         <w:r>
           <w:rPr>
-            <w:color w:val="278F91"/>
+            <w:color w:val="247F87"/>
             <w:u w:val="single"/>
+            <w:rFonts w:ascii="Noto Serif" w:eastAsia="Noto Serif"/>
+            <w:sz w:val="18"/>
           </w:rPr>
           <w:t>Academia de Lenguas Mayas de Guatemala, “Idioma Maya K’iche’”</w:t>
         </w:r>
       </w:hyperlink>
       <w:r>
+        <w:rPr>
+          <w:rFonts w:ascii="Noto Serif" w:hAnsi="Noto Serif" w:eastAsia="Noto Serif"/>
+          <w:color w:val="252B42"/>
+          <w:sz w:val="18"/>
+        </w:rPr>
         <w:t xml:space="preserve"> — языковые сведения и данные переписи 2018 года.</w:t>
       </w:r>
     </w:p>
     <w:sectPr>
       <w:headerReference w:type="default" r:id="rId9"/>
       <w:footerReference w:type="default" r:id="rId10"/>
-      <w:pgSz w:w="8391" w:h="11906"/>
-      <w:pgMar w:top="1077" w:right="1020" w:bottom="1020" w:left="1077" w:header="510" w:footer="510" w:gutter="0"/>
+      <w:pgSz w:w="9638" w:h="13606"/>
+      <w:pgMar w:top="1077" w:right="1020" w:bottom="1077" w:left="1020" w:header="454" w:footer="454" w:gutter="0"/>
       <w:cols w:space="720"/>
+      <w:titlePg/>
       <w:docGrid w:linePitch="360"/>
+      <w:pgBorders w:offsetFrom="page" w:display="allPages">
+        <w:top w:val="double" w:sz="5" w:space="9" w:color="D1BE94"/>
+        <w:left w:val="double" w:sz="5" w:space="9" w:color="D1BE94"/>
+        <w:bottom w:val="double" w:sz="5" w:space="9" w:color="D1BE94"/>
+        <w:right w:val="double" w:sz="5" w:space="9" w:color="D1BE94"/>
+      </w:pgBorders>
     </w:sectPr>
   </w:body>
 </w:document>
@@ -1456,11 +2559,11 @@
     </w:pPr>
     <w:r>
       <w:rPr>
-        <w:rFonts w:ascii="Arial" w:hAnsi="Arial" w:eastAsia="Arial"/>
-        <w:color w:val="278F91"/>
+        <w:rFonts w:ascii="Noto Sans" w:hAnsi="Noto Sans" w:eastAsia="Noto Sans"/>
+        <w:color w:val="624B7D"/>
         <w:sz w:val="16"/>
       </w:rPr>
-      <w:t xml:space="preserve">HARVYRÐ  ·  </w:t>
+      <w:t xml:space="preserve">—  </w:t>
     </w:r>
     <w:r>
       <w:fldChar w:fldCharType="begin"/>
@@ -1468,6 +2571,14 @@
       <w:fldChar w:fldCharType="separate"/>
       <w:t>1</w:t>
       <w:fldChar w:fldCharType="end"/>
+    </w:r>
+    <w:r>
+      <w:rPr>
+        <w:rFonts w:ascii="Noto Sans" w:hAnsi="Noto Sans" w:eastAsia="Noto Sans"/>
+        <w:color w:val="624B7D"/>
+        <w:sz w:val="16"/>
+      </w:rPr>
+      <w:t xml:space="preserve">  —</w:t>
     </w:r>
   </w:p>
 </w:ftr>
@@ -1478,15 +2589,16 @@
   <w:p>
     <w:pPr>
       <w:pStyle w:val="Header"/>
-      <w:jc w:val="right"/>
+      <w:spacing w:after="60"/>
+      <w:jc w:val="center"/>
     </w:pPr>
     <w:r>
       <w:rPr>
-        <w:rFonts w:ascii="Arial" w:hAnsi="Arial" w:eastAsia="Arial"/>
-        <w:color w:val="278F91"/>
-        <w:sz w:val="15"/>
-      </w:rPr>
-      <w:t>POPOL VUH / POPOL WUJ</w:t>
+        <w:rFonts w:ascii="Noto Sans" w:hAnsi="Noto Sans" w:eastAsia="Noto Sans"/>
+        <w:color w:val="526184"/>
+        <w:sz w:val="14"/>
+      </w:rPr>
+      <w:t>HARVYRÐ  ·  POPOL VUH / POPOL WUJ</w:t>
     </w:r>
   </w:p>
 </w:hdr>
@@ -1856,12 +2968,12 @@
     <w:qFormat/>
     <w:rsid w:val="00FC693F"/>
     <w:pPr>
-      <w:spacing w:line="276" w:lineRule="auto" w:after="120"/>
-      <w:ind w:firstLine="283"/>
+      <w:spacing w:line="307" w:lineRule="auto" w:after="140"/>
+      <w:ind w:firstLine="238"/>
     </w:pPr>
     <w:rPr>
-      <w:rFonts w:ascii="Georgia" w:hAnsi="Georgia" w:eastAsia="Georgia"/>
-      <w:color w:val="192C55"/>
+      <w:rFonts w:ascii="Noto Serif" w:hAnsi="Noto Serif" w:eastAsia="Noto Serif"/>
+      <w:color w:val="252B42"/>
       <w:sz w:val="21"/>
     </w:rPr>
   </w:style>
@@ -1920,15 +3032,15 @@
     <w:pPr>
       <w:keepNext/>
       <w:keepLines/>
-      <w:spacing w:before="260" w:after="120"/>
+      <w:spacing w:before="280" w:after="140"/>
       <w:outlineLvl w:val="0"/>
     </w:pPr>
     <w:rPr>
-      <w:rFonts w:asciiTheme="majorHAnsi" w:eastAsiaTheme="majorEastAsia" w:hAnsiTheme="majorHAnsi" w:cstheme="majorBidi" w:ascii="Arial" w:hAnsi="Arial" w:eastAsia="Arial"/>
+      <w:rFonts w:asciiTheme="majorHAnsi" w:eastAsiaTheme="majorEastAsia" w:hAnsiTheme="majorHAnsi" w:cstheme="majorBidi" w:ascii="Noto Sans" w:hAnsi="Noto Sans" w:eastAsia="Noto Sans"/>
       <w:b/>
       <w:bCs/>
-      <w:color w:val="192C55"/>
-      <w:sz w:val="38"/>
+      <w:color w:val="253C70"/>
+      <w:sz w:val="44"/>
       <w:szCs w:val="28"/>
     </w:rPr>
   </w:style>
@@ -1944,15 +3056,15 @@
     <w:pPr>
       <w:keepNext/>
       <w:keepLines/>
-      <w:spacing w:before="260" w:after="120"/>
+      <w:spacing w:before="280" w:after="140"/>
       <w:outlineLvl w:val="1"/>
     </w:pPr>
     <w:rPr>
-      <w:rFonts w:asciiTheme="majorHAnsi" w:eastAsiaTheme="majorEastAsia" w:hAnsiTheme="majorHAnsi" w:cstheme="majorBidi" w:ascii="Arial" w:hAnsi="Arial" w:eastAsia="Arial"/>
+      <w:rFonts w:asciiTheme="majorHAnsi" w:eastAsiaTheme="majorEastAsia" w:hAnsiTheme="majorHAnsi" w:cstheme="majorBidi" w:ascii="Noto Sans" w:hAnsi="Noto Sans" w:eastAsia="Noto Sans"/>
       <w:b/>
       <w:bCs/>
-      <w:color w:val="278F91"/>
-      <w:sz w:val="28"/>
+      <w:color w:val="624B7D"/>
+      <w:sz w:val="30"/>
       <w:szCs w:val="26"/>
     </w:rPr>
   </w:style>
@@ -1968,15 +3080,15 @@
     <w:pPr>
       <w:keepNext/>
       <w:keepLines/>
-      <w:spacing w:before="260" w:after="120"/>
+      <w:spacing w:before="280" w:after="140"/>
       <w:outlineLvl w:val="2"/>
     </w:pPr>
     <w:rPr>
-      <w:rFonts w:asciiTheme="majorHAnsi" w:eastAsiaTheme="majorEastAsia" w:hAnsiTheme="majorHAnsi" w:cstheme="majorBidi" w:ascii="Arial" w:hAnsi="Arial" w:eastAsia="Arial"/>
+      <w:rFonts w:asciiTheme="majorHAnsi" w:eastAsiaTheme="majorEastAsia" w:hAnsiTheme="majorHAnsi" w:cstheme="majorBidi" w:ascii="Noto Sans" w:hAnsi="Noto Sans" w:eastAsia="Noto Sans"/>
       <w:b/>
       <w:bCs/>
-      <w:color w:val="B58B3D"/>
-      <w:sz w:val="22"/>
+      <w:color w:val="247F87"/>
+      <w:sz w:val="24"/>
     </w:rPr>
   </w:style>
   <w:style w:type="paragraph" w:styleId="Heading4">
@@ -2211,16 +3323,16 @@
       <w:pBdr>
         <w:bottom w:val="single" w:sz="8" w:space="4" w:color="4F81BD" w:themeColor="accent1"/>
       </w:pBdr>
-      <w:spacing w:after="120" w:line="240" w:lineRule="auto" w:before="0"/>
+      <w:spacing w:after="140" w:line="240" w:lineRule="auto" w:before="0"/>
       <w:contextualSpacing/>
     </w:pPr>
     <w:rPr>
-      <w:rFonts w:asciiTheme="majorHAnsi" w:eastAsiaTheme="majorEastAsia" w:hAnsiTheme="majorHAnsi" w:cstheme="majorBidi" w:ascii="Arial" w:hAnsi="Arial" w:eastAsia="Arial"/>
+      <w:rFonts w:asciiTheme="majorHAnsi" w:eastAsiaTheme="majorEastAsia" w:hAnsiTheme="majorHAnsi" w:cstheme="majorBidi" w:ascii="Noto Serif" w:hAnsi="Noto Serif" w:eastAsia="Noto Serif"/>
       <w:b/>
-      <w:color w:val="192C55"/>
+      <w:color w:val="18264E"/>
       <w:spacing w:val="5"/>
       <w:kern w:val="28"/>
-      <w:sz w:val="56"/>
+      <w:sz w:val="46"/>
       <w:szCs w:val="52"/>
     </w:rPr>
   </w:style>
@@ -2394,8 +3506,13 @@
       <w:numPr>
         <w:numId w:val="1"/>
       </w:numPr>
+      <w:spacing w:line="259" w:lineRule="auto" w:after="20"/>
       <w:contextualSpacing/>
     </w:pPr>
+    <w:rPr>
+      <w:rFonts w:ascii="Noto Serif" w:hAnsi="Noto Serif" w:eastAsia="Noto Serif"/>
+      <w:sz w:val="18"/>
+    </w:rPr>
   </w:style>
   <w:style w:type="paragraph" w:styleId="ListBullet2">
     <w:name w:val="List Bullet 2"/>

</xml_diff>